<commit_message>
Update user manuals with all features through 2026-09-25
Adds Windows/Mac unblock-file instructions near the start of both
manuals (with screenshot), and documents every feature shipped since
the last manual update: startup project chooser, combine-projects,
folder-level Ask AI, pop-out icon grid, resumable uploads, convert-to-
PDF, multi-credential logins, chart snapshots/trends, Word databook
export, voice dictation, DeepSeek provider option, and more. Brings
the English manual up to structural parity with the Chinese one.

Co-Authored-By: Claude Sonnet 5 <noreply@anthropic.com>
</commit_message>
<xml_diff>
--- a/PMS用户手册_更新版.docx
+++ b/PMS用户手册_更新版.docx
@@ -128,7 +128,18 @@
         <w:rPr>
           <w:rFonts w:ascii="Microsoft YaHei" w:hAnsi="Microsoft YaHei" w:eastAsia="Microsoft YaHei"/>
         </w:rPr>
-        <w:t>1.3  首次启动</w:t>
+        <w:t>1.3  首次启动：选择项目</w:t>
+      </w:r>
+    </w:p>
+    <w:p>
+      <w:pPr>
+        <w:ind w:left="576"/>
+      </w:pPr>
+      <w:r>
+        <w:rPr>
+          <w:rFonts w:ascii="Microsoft YaHei" w:hAnsi="Microsoft YaHei" w:eastAsia="Microsoft YaHei"/>
+        </w:rPr>
+        <w:t>1.4  Windows 提示"已阻止"？先解除阻止</w:t>
       </w:r>
     </w:p>
     <w:p>
@@ -251,7 +262,7 @@
         <w:rPr>
           <w:rFonts w:ascii="Microsoft YaHei" w:hAnsi="Microsoft YaHei" w:eastAsia="Microsoft YaHei"/>
         </w:rPr>
-        <w:t>3.6  登录信息（网站账号密码）</w:t>
+        <w:t>3.6  登录信息（网站账号密码，可保存多组）</w:t>
       </w:r>
     </w:p>
     <w:p>
@@ -267,6 +278,17 @@
     </w:p>
     <w:p>
       <w:pPr>
+        <w:ind w:left="576"/>
+      </w:pPr>
+      <w:r>
+        <w:rPr>
+          <w:rFonts w:ascii="Microsoft YaHei" w:hAnsi="Microsoft YaHei" w:eastAsia="Microsoft YaHei"/>
+        </w:rPr>
+        <w:t>3.8  批量操作文件夹（多选）</w:t>
+      </w:r>
+    </w:p>
+    <w:p>
+      <w:pPr>
         <w:ind w:left="0"/>
       </w:pPr>
       <w:r>
@@ -367,6 +389,39 @@
     </w:p>
     <w:p>
       <w:pPr>
+        <w:ind w:left="576"/>
+      </w:pPr>
+      <w:r>
+        <w:rPr>
+          <w:rFonts w:ascii="Microsoft YaHei" w:hAnsi="Microsoft YaHei" w:eastAsia="Microsoft YaHei"/>
+        </w:rPr>
+        <w:t>4.9  就单个文档提问 AI，或一键润色</w:t>
+      </w:r>
+    </w:p>
+    <w:p>
+      <w:pPr>
+        <w:ind w:left="576"/>
+      </w:pPr>
+      <w:r>
+        <w:rPr>
+          <w:rFonts w:ascii="Microsoft YaHei" w:hAnsi="Microsoft YaHei" w:eastAsia="Microsoft YaHei"/>
+        </w:rPr>
+        <w:t>4.10  转换为 PDF（批量）</w:t>
+      </w:r>
+    </w:p>
+    <w:p>
+      <w:pPr>
+        <w:ind w:left="576"/>
+      </w:pPr>
+      <w:r>
+        <w:rPr>
+          <w:rFonts w:ascii="Microsoft YaHei" w:hAnsi="Microsoft YaHei" w:eastAsia="Microsoft YaHei"/>
+        </w:rPr>
+        <w:t>4.11  磁盘文件名与误删恢复</w:t>
+      </w:r>
+    </w:p>
+    <w:p>
+      <w:pPr>
         <w:ind w:left="0"/>
       </w:pPr>
       <w:r>
@@ -457,6 +512,28 @@
     </w:p>
     <w:p>
       <w:pPr>
+        <w:ind w:left="576"/>
+      </w:pPr>
+      <w:r>
+        <w:rPr>
+          <w:rFonts w:ascii="Microsoft YaHei" w:hAnsi="Microsoft YaHei" w:eastAsia="Microsoft YaHei"/>
+        </w:rPr>
+        <w:t>6.4  配置 AI 服务商（Gemini / DeepSeek）</w:t>
+      </w:r>
+    </w:p>
+    <w:p>
+      <w:pPr>
+        <w:ind w:left="576"/>
+      </w:pPr>
+      <w:r>
+        <w:rPr>
+          <w:rFonts w:ascii="Microsoft YaHei" w:hAnsi="Microsoft YaHei" w:eastAsia="Microsoft YaHei"/>
+        </w:rPr>
+        <w:t>6.5  参数-时间趋势图与保存快照</w:t>
+      </w:r>
+    </w:p>
+    <w:p>
+      <w:pPr>
         <w:ind w:left="0"/>
       </w:pPr>
       <w:r>
@@ -509,7 +586,7 @@
           <w:rFonts w:ascii="Microsoft YaHei" w:hAnsi="Microsoft YaHei" w:eastAsia="Microsoft YaHei"/>
           <w:b/>
         </w:rPr>
-        <w:t>8  生成数据手册 PDF</w:t>
+        <w:t>8  生成数据手册（PDF / Word）</w:t>
       </w:r>
     </w:p>
     <w:p>
@@ -520,7 +597,7 @@
         <w:rPr>
           <w:rFonts w:ascii="Microsoft YaHei" w:hAnsi="Microsoft YaHei" w:eastAsia="Microsoft YaHei"/>
         </w:rPr>
-        <w:t>8.1  选择文档</w:t>
+        <w:t>8.1  选择文档（PDF 模式）</w:t>
       </w:r>
     </w:p>
     <w:p>
@@ -536,6 +613,17 @@
     </w:p>
     <w:p>
       <w:pPr>
+        <w:ind w:left="576"/>
+      </w:pPr>
+      <w:r>
+        <w:rPr>
+          <w:rFonts w:ascii="Microsoft YaHei" w:hAnsi="Microsoft YaHei" w:eastAsia="Microsoft YaHei"/>
+        </w:rPr>
+        <w:t>8.3  按文件夹自动生成 Word 数据手册</w:t>
+      </w:r>
+    </w:p>
+    <w:p>
+      <w:pPr>
         <w:ind w:left="0"/>
       </w:pPr>
       <w:r>
@@ -803,7 +891,55 @@
           <w:rFonts w:ascii="Microsoft YaHei" w:hAnsi="Microsoft YaHei" w:eastAsia="Microsoft YaHei"/>
           <w:b/>
         </w:rPr>
-        <w:t>16  常见问题与解决方法</w:t>
+        <w:t>16  同时打开多个项目</w:t>
+      </w:r>
+    </w:p>
+    <w:p>
+      <w:pPr>
+        <w:ind w:left="0"/>
+      </w:pPr>
+      <w:r>
+        <w:rPr>
+          <w:rFonts w:ascii="Microsoft YaHei" w:hAnsi="Microsoft YaHei" w:eastAsia="Microsoft YaHei"/>
+          <w:b/>
+        </w:rPr>
+        <w:t>17  合并项目</w:t>
+      </w:r>
+    </w:p>
+    <w:p>
+      <w:pPr>
+        <w:ind w:left="0"/>
+      </w:pPr>
+      <w:r>
+        <w:rPr>
+          <w:rFonts w:ascii="Microsoft YaHei" w:hAnsi="Microsoft YaHei" w:eastAsia="Microsoft YaHei"/>
+          <w:b/>
+        </w:rPr>
+        <w:t>18  文件夹级"问 AI"：批量文档问答与生成 PDF</w:t>
+      </w:r>
+    </w:p>
+    <w:p>
+      <w:pPr>
+        <w:ind w:left="0"/>
+      </w:pPr>
+      <w:r>
+        <w:rPr>
+          <w:rFonts w:ascii="Microsoft YaHei" w:hAnsi="Microsoft YaHei" w:eastAsia="Microsoft YaHei"/>
+          <w:b/>
+        </w:rPr>
+        <w:t>19  图标视图：弹出窗口与批量操作</w:t>
+      </w:r>
+    </w:p>
+    <w:p>
+      <w:pPr>
+        <w:ind w:left="0"/>
+      </w:pPr>
+      <w:r>
+        <w:rPr>
+          <w:rFonts w:ascii="Microsoft YaHei" w:hAnsi="Microsoft YaHei" w:eastAsia="Microsoft YaHei"/>
+          <w:b/>
+        </w:rPr>
+        <w:t>20  常见问题与解决方法</w:t>
       </w:r>
     </w:p>
     <w:p>
@@ -1223,7 +1359,7 @@
         <w:rPr>
           <w:rFonts w:ascii="Microsoft YaHei" w:hAnsi="Microsoft YaHei" w:eastAsia="Microsoft YaHei"/>
         </w:rPr>
-        <w:t>首次启动 DMS 时，请按以下步骤操作：</w:t>
+        <w:t>双击 DMS.app（Mac）或 DMS.exe（Windows）启动程序，会先出现一个"选择项目"的小窗口，然后才是主界面：</w:t>
       </w:r>
     </w:p>
     <w:p>
@@ -1234,7 +1370,7 @@
         <w:rPr>
           <w:rFonts w:ascii="Microsoft YaHei" w:hAnsi="Microsoft YaHei" w:eastAsia="Microsoft YaHei"/>
         </w:rPr>
-        <w:t>程序会在本机启动一个内置的 Web 服务器（固定使用 8765 端口），随后自动打开默认浏览器访问 http://127.0.0.1:8765。</w:t>
+        <w:t>【继续上次的项目 / Continue with last project】——直接打开上次退出前使用的那个项目（DMS 会在每次正常退出时自动记住当前项目的路径）；首次使用、或找不到上次的项目时，此按钮为灰色不可用。</w:t>
       </w:r>
     </w:p>
     <w:p>
@@ -1245,7 +1381,7 @@
         <w:rPr>
           <w:rFonts w:ascii="Microsoft YaHei" w:hAnsi="Microsoft YaHei" w:eastAsia="Microsoft YaHei"/>
         </w:rPr>
-        <w:t>您将看到 PMS 欢迎界面。</w:t>
+        <w:t>【选择项目… / Select a project…】——弹出系统文件夹选择框，挑选电脑上任意一个已有的 DMS 项目文件夹。</w:t>
       </w:r>
     </w:p>
     <w:p>
@@ -1256,54 +1392,15 @@
         <w:rPr>
           <w:rFonts w:ascii="Microsoft YaHei" w:hAnsi="Microsoft YaHei" w:eastAsia="Microsoft YaHei"/>
         </w:rPr>
-        <w:t>系统会提示您选择存储文件夹——所有文件和数据都将保存在此处。</w:t>
-      </w:r>
-    </w:p>
-    <w:p>
-      <w:pPr>
-        <w:pStyle w:val="ListBullet"/>
-        <w:ind w:left="360"/>
-      </w:pPr>
-      <w:r>
-        <w:rPr>
-          <w:rFonts w:ascii="Microsoft YaHei" w:hAnsi="Microsoft YaHei" w:eastAsia="Microsoft YaHei"/>
-        </w:rPr>
-        <w:t>单击顶部标题栏中的文件夹图标（存储路径按钮）。</w:t>
-      </w:r>
-    </w:p>
-    <w:p>
-      <w:pPr>
-        <w:pStyle w:val="ListBullet"/>
-        <w:ind w:left="360"/>
-      </w:pPr>
-      <w:r>
-        <w:rPr>
-          <w:rFonts w:ascii="Microsoft YaHei" w:hAnsi="Microsoft YaHei" w:eastAsia="Microsoft YaHei"/>
-        </w:rPr>
-        <w:t>输入路径，例如 C:\Users\用户名\Documents\PMS_Data（Windows）或 /Users/用户名/Documents/PMS_Data（Mac），然后确认。</w:t>
-      </w:r>
-    </w:p>
-    <w:p>
-      <w:pPr>
-        <w:pStyle w:val="ListBullet"/>
-        <w:ind w:left="360"/>
-      </w:pPr>
-      <w:r>
-        <w:rPr>
-          <w:rFonts w:ascii="Microsoft YaHei" w:hAnsi="Microsoft YaHei" w:eastAsia="Microsoft YaHei"/>
-        </w:rPr>
-        <w:t>如果该文件夹不存在，DMS 会自动创建。</w:t>
-      </w:r>
-    </w:p>
-    <w:p>
-      <w:pPr>
-        <w:pStyle w:val="ListNumber"/>
-      </w:pPr>
-      <w:r>
-        <w:rPr>
-          <w:rFonts w:ascii="Microsoft YaHei" w:hAnsi="Microsoft YaHei" w:eastAsia="Microsoft YaHei"/>
-        </w:rPr>
-        <w:t>设置存储路径后，主界面加载完成，即可开始使用。</w:t>
+        <w:t>【新建项目… / New project…】——新建一个全新的、空白的项目文件夹并直接切换使用（不会像旧版那样打开预置的演示数据）。</w:t>
+      </w:r>
+    </w:p>
+    <w:p>
+      <w:r>
+        <w:rPr>
+          <w:rFonts w:ascii="Microsoft YaHei" w:hAnsi="Microsoft YaHei" w:eastAsia="Microsoft YaHei"/>
+        </w:rPr>
+        <w:t>选定项目后，程序会在本机启动一个内置的 Web 服务器（从 8765 端口起自动寻找一个空闲端口），随后自动打开默认浏览器访问该地址，加载 PMS 主界面。</w:t>
       </w:r>
     </w:p>
     <w:p>
@@ -1324,12 +1421,172 @@
           <w:rFonts w:ascii="Microsoft YaHei" w:hAnsi="Microsoft YaHei" w:eastAsia="Microsoft YaHei"/>
           <w:color w:val="333333"/>
         </w:rPr>
-        <w:t>建议将存储路径设置在会被云盘（如 OneDrive）同步的文件夹内，以获得自动异地备份的效果，详见第 13.1 节。</w:t>
+        <w:t>需要同时处理两个不同的项目？无需退出当前窗口——见第 16 章"同时打开多个项目"。</w:t>
       </w:r>
     </w:p>
     <w:p>
       <w:r>
         <w:br w:type="page"/>
+      </w:r>
+    </w:p>
+    <w:p>
+      <w:pPr>
+        <w:pStyle w:val="Heading2"/>
+      </w:pPr>
+      <w:r>
+        <w:rPr>
+          <w:rFonts w:ascii="Microsoft YaHei" w:hAnsi="Microsoft YaHei" w:eastAsia="Microsoft YaHei"/>
+          <w:color w:val="1D4E89"/>
+        </w:rPr>
+        <w:t>1.4  Windows 提示"已阻止"？先解除阻止</w:t>
+      </w:r>
+    </w:p>
+    <w:p>
+      <w:r>
+        <w:rPr>
+          <w:rFonts w:ascii="Microsoft YaHei" w:hAnsi="Microsoft YaHei" w:eastAsia="Microsoft YaHei"/>
+        </w:rPr>
+        <w:t>从网络（邮件、微信、网盘链接等）收到的 DMS.zip / DMS.exe，Windows 会自动给文件打上"从其他计算机下载"的标记，导致启动时反复弹出安全提示，或者双击没有反应。首次使用请按以下步骤解除阻止（只需做一次；重新下载新版本后可能需要再做一次）：</w:t>
+      </w:r>
+    </w:p>
+    <w:p>
+      <w:pPr>
+        <w:pStyle w:val="ListNumber"/>
+      </w:pPr>
+      <w:r>
+        <w:rPr>
+          <w:rFonts w:ascii="Microsoft YaHei" w:hAnsi="Microsoft YaHei" w:eastAsia="Microsoft YaHei"/>
+        </w:rPr>
+        <w:t>如果启动 DMS.exe 时出现安全警告（或双击后长时间没有反应）。</w:t>
+      </w:r>
+    </w:p>
+    <w:p>
+      <w:pPr>
+        <w:pStyle w:val="ListNumber"/>
+      </w:pPr>
+      <w:r>
+        <w:rPr>
+          <w:rFonts w:ascii="Microsoft YaHei" w:hAnsi="Microsoft YaHei" w:eastAsia="Microsoft YaHei"/>
+        </w:rPr>
+        <w:t>右键单击 DMS.exe。</w:t>
+      </w:r>
+    </w:p>
+    <w:p>
+      <w:pPr>
+        <w:pStyle w:val="ListNumber"/>
+      </w:pPr>
+      <w:r>
+        <w:rPr>
+          <w:rFonts w:ascii="Microsoft YaHei" w:hAnsi="Microsoft YaHei" w:eastAsia="Microsoft YaHei"/>
+        </w:rPr>
+        <w:t>在右键菜单中选择【属性（Properties）】。</w:t>
+      </w:r>
+    </w:p>
+    <w:p>
+      <w:pPr>
+        <w:pStyle w:val="ListNumber"/>
+      </w:pPr>
+      <w:r>
+        <w:rPr>
+          <w:rFonts w:ascii="Microsoft YaHei" w:hAnsi="Microsoft YaHei" w:eastAsia="Microsoft YaHei"/>
+        </w:rPr>
+        <w:t>在【常规】标签页底部的【安全】区域，勾选【解除锁定（Unblock）】复选框。</w:t>
+      </w:r>
+    </w:p>
+    <w:p>
+      <w:pPr>
+        <w:pStyle w:val="ListNumber"/>
+      </w:pPr>
+      <w:r>
+        <w:rPr>
+          <w:rFonts w:ascii="Microsoft YaHei" w:hAnsi="Microsoft YaHei" w:eastAsia="Microsoft YaHei"/>
+        </w:rPr>
+        <w:t>单击【应用（Apply）】。</w:t>
+      </w:r>
+    </w:p>
+    <w:p>
+      <w:pPr>
+        <w:pStyle w:val="ListNumber"/>
+      </w:pPr>
+      <w:r>
+        <w:rPr>
+          <w:rFonts w:ascii="Microsoft YaHei" w:hAnsi="Microsoft YaHei" w:eastAsia="Microsoft YaHei"/>
+        </w:rPr>
+        <w:t>单击【确定（OK）】关闭窗口。</w:t>
+      </w:r>
+    </w:p>
+    <w:p>
+      <w:pPr>
+        <w:jc w:val="center"/>
+      </w:pPr>
+      <w:r>
+        <w:drawing>
+          <wp:inline xmlns:a="http://schemas.openxmlformats.org/drawingml/2006/main" xmlns:pic="http://schemas.openxmlformats.org/drawingml/2006/picture">
+            <wp:extent cx="5486400" cy="7614053"/>
+            <wp:docPr id="1" name="Picture 1"/>
+            <wp:cNvGraphicFramePr>
+              <a:graphicFrameLocks noChangeAspect="1"/>
+            </wp:cNvGraphicFramePr>
+            <a:graphic>
+              <a:graphicData uri="http://schemas.openxmlformats.org/drawingml/2006/picture">
+                <pic:pic>
+                  <pic:nvPicPr>
+                    <pic:cNvPr id="0" name="25_windows_unblock.png"/>
+                    <pic:cNvPicPr/>
+                  </pic:nvPicPr>
+                  <pic:blipFill>
+                    <a:blip r:embed="rId9"/>
+                    <a:stretch>
+                      <a:fillRect/>
+                    </a:stretch>
+                  </pic:blipFill>
+                  <pic:spPr>
+                    <a:xfrm>
+                      <a:off x="0" y="0"/>
+                      <a:ext cx="5486400" cy="7614053"/>
+                    </a:xfrm>
+                    <a:prstGeom prst="rect"/>
+                  </pic:spPr>
+                </pic:pic>
+              </a:graphicData>
+            </a:graphic>
+          </wp:inline>
+        </w:drawing>
+      </w:r>
+    </w:p>
+    <w:p>
+      <w:pPr>
+        <w:jc w:val="center"/>
+      </w:pPr>
+      <w:r>
+        <w:rPr>
+          <w:rFonts w:ascii="Microsoft YaHei" w:hAnsi="Microsoft YaHei" w:eastAsia="Microsoft YaHei"/>
+          <w:i/>
+          <w:color w:val="707070"/>
+          <w:sz w:val="18"/>
+        </w:rPr>
+        <w:t>图 1-1　DMS.exe 属性窗口：勾选"解除锁定"后依次点击"应用"、"确定"</w:t>
+      </w:r>
+    </w:p>
+    <w:p/>
+    <w:p>
+      <w:pPr>
+        <w:ind w:left="576" w:right="576"/>
+        <w:shd w:val="clear" w:color="auto" w:fill="FFF8E1"/>
+      </w:pPr>
+      <w:r>
+        <w:rPr>
+          <w:rFonts w:ascii="Microsoft YaHei" w:hAnsi="Microsoft YaHei" w:eastAsia="Microsoft YaHei"/>
+          <w:b/>
+          <w:color w:val="924E00"/>
+        </w:rPr>
+        <w:t>注意：</w:t>
+      </w:r>
+      <w:r>
+        <w:rPr>
+          <w:rFonts w:ascii="Microsoft YaHei" w:hAnsi="Microsoft YaHei" w:eastAsia="Microsoft YaHei"/>
+        </w:rPr>
+        <w:t>这与第 1.2 节提到的 SmartScreen"仍要运行"提示是同一类 Windows 安全机制在不同环节的表现，解除阻止后两者通常都会消失。用"原生程序打开"（第 4.5 节）某份文档时如果提示文件被锁定为只读，也是同样的原因，DMS 会在打开前自动尝试解锁，一般无需手动处理。</w:t>
       </w:r>
     </w:p>
     <w:p>
@@ -1579,7 +1836,7 @@
         <w:drawing>
           <wp:inline xmlns:a="http://schemas.openxmlformats.org/drawingml/2006/main" xmlns:pic="http://schemas.openxmlformats.org/drawingml/2006/picture">
             <wp:extent cx="5486400" cy="3429000"/>
-            <wp:docPr id="1" name="Picture 1"/>
+            <wp:docPr id="2" name="Picture 2"/>
             <wp:cNvGraphicFramePr>
               <a:graphicFrameLocks noChangeAspect="1"/>
             </wp:cNvGraphicFramePr>
@@ -1591,7 +1848,7 @@
                     <pic:cNvPicPr/>
                   </pic:nvPicPr>
                   <pic:blipFill>
-                    <a:blip r:embed="rId9"/>
+                    <a:blip r:embed="rId10"/>
                     <a:stretch>
                       <a:fillRect/>
                     </a:stretch>
@@ -1625,6 +1882,27 @@
       </w:r>
     </w:p>
     <w:p/>
+    <w:p>
+      <w:pPr>
+        <w:ind w:left="576" w:right="576"/>
+        <w:shd w:val="clear" w:color="auto" w:fill="E6F4EA"/>
+      </w:pPr>
+      <w:r>
+        <w:rPr>
+          <w:rFonts w:ascii="Microsoft YaHei" w:hAnsi="Microsoft YaHei" w:eastAsia="Microsoft YaHei"/>
+          <w:b/>
+          <w:color w:val="056F00"/>
+        </w:rPr>
+        <w:t>提示：</w:t>
+      </w:r>
+      <w:r>
+        <w:rPr>
+          <w:rFonts w:ascii="Microsoft YaHei" w:hAnsi="Microsoft YaHei" w:eastAsia="Microsoft YaHei"/>
+          <w:color w:val="333333"/>
+        </w:rPr>
+        <w:t>几乎全部文字输入框（文件夹／文档名称、序列号、登录信息、描述、搜索框、AI 提问框等）右侧都配有一个麦克风图标——单击后对着麦克风说话，识别结果会自动追加到光标处，说完再单击一次停止。可在中文／English 之间切换识别语言，无需配置任何 AI Key 即可使用（由浏览器自带的语音识别完成，推荐 Chrome / Edge）。</w:t>
+      </w:r>
+    </w:p>
     <w:p>
       <w:pPr>
         <w:pStyle w:val="Heading2"/>
@@ -2190,7 +2468,7 @@
         <w:drawing>
           <wp:inline xmlns:a="http://schemas.openxmlformats.org/drawingml/2006/main" xmlns:pic="http://schemas.openxmlformats.org/drawingml/2006/picture">
             <wp:extent cx="5486400" cy="3429000"/>
-            <wp:docPr id="2" name="Picture 2"/>
+            <wp:docPr id="3" name="Picture 3"/>
             <wp:cNvGraphicFramePr>
               <a:graphicFrameLocks noChangeAspect="1"/>
             </wp:cNvGraphicFramePr>
@@ -2199,60 +2477,6 @@
                 <pic:pic>
                   <pic:nvPicPr>
                     <pic:cNvPr id="0" name="02_folder_with_sn.png"/>
-                    <pic:cNvPicPr/>
-                  </pic:nvPicPr>
-                  <pic:blipFill>
-                    <a:blip r:embed="rId10"/>
-                    <a:stretch>
-                      <a:fillRect/>
-                    </a:stretch>
-                  </pic:blipFill>
-                  <pic:spPr>
-                    <a:xfrm>
-                      <a:off x="0" y="0"/>
-                      <a:ext cx="5486400" cy="3429000"/>
-                    </a:xfrm>
-                    <a:prstGeom prst="rect"/>
-                  </pic:spPr>
-                </pic:pic>
-              </a:graphicData>
-            </a:graphic>
-          </wp:inline>
-        </w:drawing>
-      </w:r>
-    </w:p>
-    <w:p>
-      <w:pPr>
-        <w:jc w:val="center"/>
-      </w:pPr>
-      <w:r>
-        <w:rPr>
-          <w:rFonts w:ascii="Microsoft YaHei" w:hAnsi="Microsoft YaHei" w:eastAsia="Microsoft YaHei"/>
-          <w:i/>
-          <w:color w:val="707070"/>
-          <w:sz w:val="18"/>
-        </w:rPr>
-        <w:t>图 3-1　带序列号的文件夹（房屋保险 · INS-2026-001）</w:t>
-      </w:r>
-    </w:p>
-    <w:p/>
-    <w:p>
-      <w:pPr>
-        <w:jc w:val="center"/>
-      </w:pPr>
-      <w:r>
-        <w:drawing>
-          <wp:inline xmlns:a="http://schemas.openxmlformats.org/drawingml/2006/main" xmlns:pic="http://schemas.openxmlformats.org/drawingml/2006/picture">
-            <wp:extent cx="5486400" cy="3429000"/>
-            <wp:docPr id="3" name="Picture 3"/>
-            <wp:cNvGraphicFramePr>
-              <a:graphicFrameLocks noChangeAspect="1"/>
-            </wp:cNvGraphicFramePr>
-            <a:graphic>
-              <a:graphicData uri="http://schemas.openxmlformats.org/drawingml/2006/picture">
-                <pic:pic>
-                  <pic:nvPicPr>
-                    <pic:cNvPr id="0" name="03_folder_edit_mode.png"/>
                     <pic:cNvPicPr/>
                   </pic:nvPicPr>
                   <pic:blipFill>
@@ -2286,6 +2510,60 @@
           <w:color w:val="707070"/>
           <w:sz w:val="18"/>
         </w:rPr>
+        <w:t>图 3-1　带序列号的文件夹（房屋保险 · INS-2026-001）</w:t>
+      </w:r>
+    </w:p>
+    <w:p/>
+    <w:p>
+      <w:pPr>
+        <w:jc w:val="center"/>
+      </w:pPr>
+      <w:r>
+        <w:drawing>
+          <wp:inline xmlns:a="http://schemas.openxmlformats.org/drawingml/2006/main" xmlns:pic="http://schemas.openxmlformats.org/drawingml/2006/picture">
+            <wp:extent cx="5486400" cy="3429000"/>
+            <wp:docPr id="4" name="Picture 4"/>
+            <wp:cNvGraphicFramePr>
+              <a:graphicFrameLocks noChangeAspect="1"/>
+            </wp:cNvGraphicFramePr>
+            <a:graphic>
+              <a:graphicData uri="http://schemas.openxmlformats.org/drawingml/2006/picture">
+                <pic:pic>
+                  <pic:nvPicPr>
+                    <pic:cNvPr id="0" name="03_folder_edit_mode.png"/>
+                    <pic:cNvPicPr/>
+                  </pic:nvPicPr>
+                  <pic:blipFill>
+                    <a:blip r:embed="rId12"/>
+                    <a:stretch>
+                      <a:fillRect/>
+                    </a:stretch>
+                  </pic:blipFill>
+                  <pic:spPr>
+                    <a:xfrm>
+                      <a:off x="0" y="0"/>
+                      <a:ext cx="5486400" cy="3429000"/>
+                    </a:xfrm>
+                    <a:prstGeom prst="rect"/>
+                  </pic:spPr>
+                </pic:pic>
+              </a:graphicData>
+            </a:graphic>
+          </wp:inline>
+        </w:drawing>
+      </w:r>
+    </w:p>
+    <w:p>
+      <w:pPr>
+        <w:jc w:val="center"/>
+      </w:pPr>
+      <w:r>
+        <w:rPr>
+          <w:rFonts w:ascii="Microsoft YaHei" w:hAnsi="Microsoft YaHei" w:eastAsia="Microsoft YaHei"/>
+          <w:i/>
+          <w:color w:val="707070"/>
+          <w:sz w:val="18"/>
+        </w:rPr>
         <w:t>图 3-2　文件夹编辑模式：名称、序列号与登录信息字段</w:t>
       </w:r>
     </w:p>
@@ -2402,7 +2680,7 @@
         <w:drawing>
           <wp:inline xmlns:a="http://schemas.openxmlformats.org/drawingml/2006/main" xmlns:pic="http://schemas.openxmlformats.org/drawingml/2006/picture">
             <wp:extent cx="5486400" cy="3108295"/>
-            <wp:docPr id="4" name="Picture 4"/>
+            <wp:docPr id="5" name="Picture 5"/>
             <wp:cNvGraphicFramePr>
               <a:graphicFrameLocks noChangeAspect="1"/>
             </wp:cNvGraphicFramePr>
@@ -2414,7 +2692,7 @@
                     <pic:cNvPicPr/>
                   </pic:nvPicPr>
                   <pic:blipFill>
-                    <a:blip r:embed="rId12"/>
+                    <a:blip r:embed="rId13"/>
                     <a:stretch>
                       <a:fillRect/>
                     </a:stretch>
@@ -2519,15 +2797,15 @@
           <w:rFonts w:ascii="Microsoft YaHei" w:hAnsi="Microsoft YaHei" w:eastAsia="Microsoft YaHei"/>
           <w:color w:val="1D4E89"/>
         </w:rPr>
-        <w:t>3.6  登录信息（网站账号密码）</w:t>
-      </w:r>
-    </w:p>
-    <w:p>
-      <w:r>
-        <w:rPr>
-          <w:rFonts w:ascii="Microsoft YaHei" w:hAnsi="Microsoft YaHei" w:eastAsia="Microsoft YaHei"/>
-        </w:rPr>
-        <w:t>如果某个文件夹对应一个需要登录的网站或在线账户（例如保险公司客户门户、医院患者门户），可以把该网站的登录信息直接保存在这个文件夹上，方便日后快速登录。</w:t>
+        <w:t>3.6  登录信息（网站账号密码，可保存多组）</w:t>
+      </w:r>
+    </w:p>
+    <w:p>
+      <w:r>
+        <w:rPr>
+          <w:rFonts w:ascii="Microsoft YaHei" w:hAnsi="Microsoft YaHei" w:eastAsia="Microsoft YaHei"/>
+        </w:rPr>
+        <w:t>如果某个文件夹对应一个需要登录的网站或在线账户（例如保险公司客户门户、医院患者门户），可以把该网站的登录信息直接保存在这个文件夹上，方便日后快速登录。一个文件夹不再局限于一组账号密码——可以按需添加任意多组，例如同一台设备的"经销商门户"和"厂家备件门户"分开保存。</w:t>
       </w:r>
     </w:p>
     <w:p>
@@ -2549,7 +2827,7 @@
         <w:rPr>
           <w:rFonts w:ascii="Microsoft YaHei" w:hAnsi="Microsoft YaHei" w:eastAsia="Microsoft YaHei"/>
         </w:rPr>
-        <w:t>在【登录信息（可选）】区域填写：网站链接、账号／用户名、密码。</w:t>
+        <w:t>在【登录信息（可选，可添加多组）】区域填写：网站链接、账号／用户名、密码。</w:t>
       </w:r>
     </w:p>
     <w:p>
@@ -2560,39 +2838,18 @@
         <w:rPr>
           <w:rFonts w:ascii="Microsoft YaHei" w:hAnsi="Microsoft YaHei" w:eastAsia="Microsoft YaHei"/>
         </w:rPr>
+        <w:t>需要再保存一组时，单击【添加登录信息】即可新增一组同样的三个字段；每组右侧的【×】用于删除该组。</w:t>
+      </w:r>
+    </w:p>
+    <w:p>
+      <w:pPr>
+        <w:pStyle w:val="ListNumber"/>
+      </w:pPr>
+      <w:r>
+        <w:rPr>
+          <w:rFonts w:ascii="Microsoft YaHei" w:hAnsi="Microsoft YaHei" w:eastAsia="Microsoft YaHei"/>
+        </w:rPr>
         <w:t>单击【完成】保存。</w:t>
-      </w:r>
-    </w:p>
-    <w:p>
-      <w:r>
-        <w:rPr>
-          <w:rFonts w:ascii="Microsoft YaHei" w:hAnsi="Microsoft YaHei" w:eastAsia="Microsoft YaHei"/>
-        </w:rPr>
-        <w:t>查看模式下会出现两个按钮：</w:t>
-      </w:r>
-    </w:p>
-    <w:p>
-      <w:pPr>
-        <w:pStyle w:val="ListBullet"/>
-        <w:ind w:left="360"/>
-      </w:pPr>
-      <w:r>
-        <w:rPr>
-          <w:rFonts w:ascii="Microsoft YaHei" w:hAnsi="Microsoft YaHei" w:eastAsia="Microsoft YaHei"/>
-        </w:rPr>
-        <w:t>【打开网站】——在新标签页打开该网站，并自动将账号复制到剪贴板，方便粘贴到用户名输入框。</w:t>
-      </w:r>
-    </w:p>
-    <w:p>
-      <w:pPr>
-        <w:pStyle w:val="ListBullet"/>
-        <w:ind w:left="360"/>
-      </w:pPr>
-      <w:r>
-        <w:rPr>
-          <w:rFonts w:ascii="Microsoft YaHei" w:hAnsi="Microsoft YaHei" w:eastAsia="Microsoft YaHei"/>
-        </w:rPr>
-        <w:t>【复制密码】——将密码复制到剪贴板，方便粘贴到密码输入框。</w:t>
       </w:r>
     </w:p>
     <w:p>
@@ -2602,8 +2859,8 @@
       <w:r>
         <w:drawing>
           <wp:inline xmlns:a="http://schemas.openxmlformats.org/drawingml/2006/main" xmlns:pic="http://schemas.openxmlformats.org/drawingml/2006/picture">
-            <wp:extent cx="5486400" cy="3429000"/>
-            <wp:docPr id="5" name="Picture 5"/>
+            <wp:extent cx="5486400" cy="2741275"/>
+            <wp:docPr id="6" name="Picture 6"/>
             <wp:cNvGraphicFramePr>
               <a:graphicFrameLocks noChangeAspect="1"/>
             </wp:cNvGraphicFramePr>
@@ -2611,11 +2868,247 @@
               <a:graphicData uri="http://schemas.openxmlformats.org/drawingml/2006/picture">
                 <pic:pic>
                   <pic:nvPicPr>
-                    <pic:cNvPr id="0" name="04_login_info_view.png"/>
+                    <pic:cNvPr id="0" name="35_multi_login_credentials.png"/>
                     <pic:cNvPicPr/>
                   </pic:nvPicPr>
                   <pic:blipFill>
-                    <a:blip r:embed="rId13"/>
+                    <a:blip r:embed="rId14"/>
+                    <a:stretch>
+                      <a:fillRect/>
+                    </a:stretch>
+                  </pic:blipFill>
+                  <pic:spPr>
+                    <a:xfrm>
+                      <a:off x="0" y="0"/>
+                      <a:ext cx="5486400" cy="2741275"/>
+                    </a:xfrm>
+                    <a:prstGeom prst="rect"/>
+                  </pic:spPr>
+                </pic:pic>
+              </a:graphicData>
+            </a:graphic>
+          </wp:inline>
+        </w:drawing>
+      </w:r>
+    </w:p>
+    <w:p>
+      <w:pPr>
+        <w:jc w:val="center"/>
+      </w:pPr>
+      <w:r>
+        <w:rPr>
+          <w:rFonts w:ascii="Microsoft YaHei" w:hAnsi="Microsoft YaHei" w:eastAsia="Microsoft YaHei"/>
+          <w:i/>
+          <w:color w:val="707070"/>
+          <w:sz w:val="18"/>
+        </w:rPr>
+        <w:t>图 3-4　编辑模式：已添加两组登录信息（字段旁的麦克风图标可直接语音输入，见第 2.1 节）</w:t>
+      </w:r>
+    </w:p>
+    <w:p/>
+    <w:p>
+      <w:r>
+        <w:rPr>
+          <w:rFonts w:ascii="Microsoft YaHei" w:hAnsi="Microsoft YaHei" w:eastAsia="Microsoft YaHei"/>
+        </w:rPr>
+        <w:t>查看模式下，每一组登录信息各自显示三个按钮，并直接显示账号，无需先解密即可核对是哪一组：</w:t>
+      </w:r>
+    </w:p>
+    <w:p>
+      <w:pPr>
+        <w:pStyle w:val="ListBullet"/>
+        <w:ind w:left="360"/>
+      </w:pPr>
+      <w:r>
+        <w:rPr>
+          <w:rFonts w:ascii="Microsoft YaHei" w:hAnsi="Microsoft YaHei" w:eastAsia="Microsoft YaHei"/>
+        </w:rPr>
+        <w:t>【打开网站】——在新标签页打开该网站，并自动将账号复制到剪贴板，方便粘贴到用户名输入框。</w:t>
+      </w:r>
+    </w:p>
+    <w:p>
+      <w:pPr>
+        <w:pStyle w:val="ListBullet"/>
+        <w:ind w:left="360"/>
+      </w:pPr>
+      <w:r>
+        <w:rPr>
+          <w:rFonts w:ascii="Microsoft YaHei" w:hAnsi="Microsoft YaHei" w:eastAsia="Microsoft YaHei"/>
+        </w:rPr>
+        <w:t>【复制账号】——一键把账号复制到剪贴板，不用再从密文里选中文字。</w:t>
+      </w:r>
+    </w:p>
+    <w:p>
+      <w:pPr>
+        <w:pStyle w:val="ListBullet"/>
+        <w:ind w:left="360"/>
+      </w:pPr>
+      <w:r>
+        <w:rPr>
+          <w:rFonts w:ascii="Microsoft YaHei" w:hAnsi="Microsoft YaHei" w:eastAsia="Microsoft YaHei"/>
+        </w:rPr>
+        <w:t>【复制密码】——将密码复制到剪贴板，方便粘贴到密码输入框。</w:t>
+      </w:r>
+    </w:p>
+    <w:p>
+      <w:pPr>
+        <w:jc w:val="center"/>
+      </w:pPr>
+      <w:r>
+        <w:drawing>
+          <wp:inline xmlns:a="http://schemas.openxmlformats.org/drawingml/2006/main" xmlns:pic="http://schemas.openxmlformats.org/drawingml/2006/picture">
+            <wp:extent cx="5486400" cy="2741275"/>
+            <wp:docPr id="7" name="Picture 7"/>
+            <wp:cNvGraphicFramePr>
+              <a:graphicFrameLocks noChangeAspect="1"/>
+            </wp:cNvGraphicFramePr>
+            <a:graphic>
+              <a:graphicData uri="http://schemas.openxmlformats.org/drawingml/2006/picture">
+                <pic:pic>
+                  <pic:nvPicPr>
+                    <pic:cNvPr id="0" name="36_multi_login_view.png"/>
+                    <pic:cNvPicPr/>
+                  </pic:nvPicPr>
+                  <pic:blipFill>
+                    <a:blip r:embed="rId15"/>
+                    <a:stretch>
+                      <a:fillRect/>
+                    </a:stretch>
+                  </pic:blipFill>
+                  <pic:spPr>
+                    <a:xfrm>
+                      <a:off x="0" y="0"/>
+                      <a:ext cx="5486400" cy="2741275"/>
+                    </a:xfrm>
+                    <a:prstGeom prst="rect"/>
+                  </pic:spPr>
+                </pic:pic>
+              </a:graphicData>
+            </a:graphic>
+          </wp:inline>
+        </w:drawing>
+      </w:r>
+    </w:p>
+    <w:p>
+      <w:pPr>
+        <w:jc w:val="center"/>
+      </w:pPr>
+      <w:r>
+        <w:rPr>
+          <w:rFonts w:ascii="Microsoft YaHei" w:hAnsi="Microsoft YaHei" w:eastAsia="Microsoft YaHei"/>
+          <w:i/>
+          <w:color w:val="707070"/>
+          <w:sz w:val="18"/>
+        </w:rPr>
+        <w:t>图 3-5　查看模式：两组登录信息并列显示</w:t>
+      </w:r>
+    </w:p>
+    <w:p/>
+    <w:p>
+      <w:pPr>
+        <w:ind w:left="576" w:right="576"/>
+        <w:shd w:val="clear" w:color="auto" w:fill="FFF8E1"/>
+      </w:pPr>
+      <w:r>
+        <w:rPr>
+          <w:rFonts w:ascii="Microsoft YaHei" w:hAnsi="Microsoft YaHei" w:eastAsia="Microsoft YaHei"/>
+          <w:b/>
+          <w:color w:val="924E00"/>
+        </w:rPr>
+        <w:t>注意：</w:t>
+      </w:r>
+      <w:r>
+        <w:rPr>
+          <w:rFonts w:ascii="Microsoft YaHei" w:hAnsi="Microsoft YaHei" w:eastAsia="Microsoft YaHei"/>
+        </w:rPr>
+        <w:t>出于安全考虑，密码在服务器端使用加密方式存储（密钥保存在本机用户目录中，不随存储文件夹一起同步），并且只有在您点击【打开网站】【复制账号】或【复制密码】时才会被临时解密，不会随文件夹树的常规读取一并传输。由于密码在没有设置访问密码时同样可以被局域网内的其他访问者读取，建议在使用此功能前先设置第 14 章所述的访问密码。</w:t>
+      </w:r>
+    </w:p>
+    <w:p>
+      <w:pPr>
+        <w:pStyle w:val="Heading2"/>
+      </w:pPr>
+      <w:r>
+        <w:rPr>
+          <w:rFonts w:ascii="Microsoft YaHei" w:hAnsi="Microsoft YaHei" w:eastAsia="Microsoft YaHei"/>
+          <w:color w:val="1D4E89"/>
+        </w:rPr>
+        <w:t>3.7  文本树预览</w:t>
+      </w:r>
+    </w:p>
+    <w:p>
+      <w:r>
+        <w:rPr>
+          <w:rFonts w:ascii="Microsoft YaHei" w:hAnsi="Microsoft YaHei" w:eastAsia="Microsoft YaHei"/>
+        </w:rPr>
+        <w:t>如果需要将整个文件夹结构以纯文本形式复制或导出（例如粘贴到聊天软件或文档中），可以使用文本树功能。</w:t>
+      </w:r>
+    </w:p>
+    <w:p>
+      <w:pPr>
+        <w:pStyle w:val="ListNumber"/>
+      </w:pPr>
+      <w:r>
+        <w:rPr>
+          <w:rFonts w:ascii="Microsoft YaHei" w:hAnsi="Microsoft YaHei" w:eastAsia="Microsoft YaHei"/>
+        </w:rPr>
+        <w:t>在树形标签中单击左上角的【文本树】按钮。</w:t>
+      </w:r>
+    </w:p>
+    <w:p>
+      <w:pPr>
+        <w:pStyle w:val="ListNumber"/>
+      </w:pPr>
+      <w:r>
+        <w:rPr>
+          <w:rFonts w:ascii="Microsoft YaHei" w:hAnsi="Microsoft YaHei" w:eastAsia="Microsoft YaHei"/>
+        </w:rPr>
+        <w:t>弹出的预览窗口以线框图形式显示完整的文件夹层级。</w:t>
+      </w:r>
+    </w:p>
+    <w:p>
+      <w:pPr>
+        <w:pStyle w:val="ListNumber"/>
+      </w:pPr>
+      <w:r>
+        <w:rPr>
+          <w:rFonts w:ascii="Microsoft YaHei" w:hAnsi="Microsoft YaHei" w:eastAsia="Microsoft YaHei"/>
+        </w:rPr>
+        <w:t>勾选【显示序列号】可在每个文件夹名称后附加其 SN 与文档数量。</w:t>
+      </w:r>
+    </w:p>
+    <w:p>
+      <w:pPr>
+        <w:pStyle w:val="ListNumber"/>
+      </w:pPr>
+      <w:r>
+        <w:rPr>
+          <w:rFonts w:ascii="Microsoft YaHei" w:hAnsi="Microsoft YaHei" w:eastAsia="Microsoft YaHei"/>
+        </w:rPr>
+        <w:t>单击【复制】将文本复制到剪贴板，或单击【导出 .txt】保存为文本文件。</w:t>
+      </w:r>
+    </w:p>
+    <w:p>
+      <w:pPr>
+        <w:jc w:val="center"/>
+      </w:pPr>
+      <w:r>
+        <w:drawing>
+          <wp:inline xmlns:a="http://schemas.openxmlformats.org/drawingml/2006/main" xmlns:pic="http://schemas.openxmlformats.org/drawingml/2006/picture">
+            <wp:extent cx="5486400" cy="3429000"/>
+            <wp:docPr id="8" name="Picture 8"/>
+            <wp:cNvGraphicFramePr>
+              <a:graphicFrameLocks noChangeAspect="1"/>
+            </wp:cNvGraphicFramePr>
+            <a:graphic>
+              <a:graphicData uri="http://schemas.openxmlformats.org/drawingml/2006/picture">
+                <pic:pic>
+                  <pic:nvPicPr>
+                    <pic:cNvPr id="0" name="17_text_tree.png"/>
+                    <pic:cNvPicPr/>
+                  </pic:nvPicPr>
+                  <pic:blipFill>
+                    <a:blip r:embed="rId16"/>
                     <a:stretch>
                       <a:fillRect/>
                     </a:stretch>
@@ -2645,32 +3138,12 @@
           <w:color w:val="707070"/>
           <w:sz w:val="18"/>
         </w:rPr>
-        <w:t>图 3-4　已保存登录信息后的查看模式</w:t>
+        <w:t>图 3-4　文本树预览窗口</w:t>
       </w:r>
     </w:p>
     <w:p/>
     <w:p>
       <w:pPr>
-        <w:ind w:left="576" w:right="576"/>
-        <w:shd w:val="clear" w:color="auto" w:fill="FFF8E1"/>
-      </w:pPr>
-      <w:r>
-        <w:rPr>
-          <w:rFonts w:ascii="Microsoft YaHei" w:hAnsi="Microsoft YaHei" w:eastAsia="Microsoft YaHei"/>
-          <w:b/>
-          <w:color w:val="924E00"/>
-        </w:rPr>
-        <w:t>注意：</w:t>
-      </w:r>
-      <w:r>
-        <w:rPr>
-          <w:rFonts w:ascii="Microsoft YaHei" w:hAnsi="Microsoft YaHei" w:eastAsia="Microsoft YaHei"/>
-        </w:rPr>
-        <w:t>出于安全考虑，密码在服务器端使用加密方式存储（密钥保存在本机用户目录中，不随存储文件夹一起同步），并且只有在您点击【打开网站】或【复制密码】时才会被临时解密，不会随文件夹树的常规读取一并传输。由于密码在没有设置访问密码时同样可以被局域网内的其他访问者读取，建议在使用此功能前先设置第 14 章所述的访问密码。</w:t>
-      </w:r>
-    </w:p>
-    <w:p>
-      <w:pPr>
         <w:pStyle w:val="Heading2"/>
       </w:pPr>
       <w:r>
@@ -2678,15 +3151,15 @@
           <w:rFonts w:ascii="Microsoft YaHei" w:hAnsi="Microsoft YaHei" w:eastAsia="Microsoft YaHei"/>
           <w:color w:val="1D4E89"/>
         </w:rPr>
-        <w:t>3.7  文本树预览</w:t>
-      </w:r>
-    </w:p>
-    <w:p>
-      <w:r>
-        <w:rPr>
-          <w:rFonts w:ascii="Microsoft YaHei" w:hAnsi="Microsoft YaHei" w:eastAsia="Microsoft YaHei"/>
-        </w:rPr>
-        <w:t>如果需要将整个文件夹结构以纯文本形式复制或导出（例如粘贴到聊天软件或文档中），可以使用文本树功能。</w:t>
+        <w:t>3.8  批量操作文件夹（多选）</w:t>
+      </w:r>
+    </w:p>
+    <w:p>
+      <w:r>
+        <w:rPr>
+          <w:rFonts w:ascii="Microsoft YaHei" w:hAnsi="Microsoft YaHei" w:eastAsia="Microsoft YaHei"/>
+        </w:rPr>
+        <w:t>需要一次删除或导出好几个文件夹时，不用再一个一个点。</w:t>
       </w:r>
     </w:p>
     <w:p>
@@ -2697,7 +3170,7 @@
         <w:rPr>
           <w:rFonts w:ascii="Microsoft YaHei" w:hAnsi="Microsoft YaHei" w:eastAsia="Microsoft YaHei"/>
         </w:rPr>
-        <w:t>在树形标签中单击左上角的【文本树】按钮。</w:t>
+        <w:t>在树形标签左上角单击【多选文件夹】。</w:t>
       </w:r>
     </w:p>
     <w:p>
@@ -2708,7 +3181,7 @@
         <w:rPr>
           <w:rFonts w:ascii="Microsoft YaHei" w:hAnsi="Microsoft YaHei" w:eastAsia="Microsoft YaHei"/>
         </w:rPr>
-        <w:t>弹出的预览窗口以线框图形式显示完整的文件夹层级。</w:t>
+        <w:t>工具栏切换为多选模式，每个文件夹名称前出现勾选框。</w:t>
       </w:r>
     </w:p>
     <w:p>
@@ -2719,7 +3192,7 @@
         <w:rPr>
           <w:rFonts w:ascii="Microsoft YaHei" w:hAnsi="Microsoft YaHei" w:eastAsia="Microsoft YaHei"/>
         </w:rPr>
-        <w:t>勾选【显示序列号】可在每个文件夹名称后附加其 SN 与文档数量。</w:t>
+        <w:t>勾选要操作的文件夹（可跨层级、跨父文件夹勾选）。</w:t>
       </w:r>
     </w:p>
     <w:p>
@@ -2730,7 +3203,18 @@
         <w:rPr>
           <w:rFonts w:ascii="Microsoft YaHei" w:hAnsi="Microsoft YaHei" w:eastAsia="Microsoft YaHei"/>
         </w:rPr>
-        <w:t>单击【复制】将文本复制到剪贴板，或单击【导出 .txt】保存为文本文件。</w:t>
+        <w:t>单击【下载】将勾选的文件夹分别导出，或单击【删除】将其批量软删除（移入"Not Show in Tree"，见第 3.2 节）。</w:t>
+      </w:r>
+    </w:p>
+    <w:p>
+      <w:pPr>
+        <w:pStyle w:val="ListNumber"/>
+      </w:pPr>
+      <w:r>
+        <w:rPr>
+          <w:rFonts w:ascii="Microsoft YaHei" w:hAnsi="Microsoft YaHei" w:eastAsia="Microsoft YaHei"/>
+        </w:rPr>
+        <w:t>单击【取消多选】退出多选模式。</w:t>
       </w:r>
     </w:p>
     <w:p>
@@ -2740,8 +3224,8 @@
       <w:r>
         <w:drawing>
           <wp:inline xmlns:a="http://schemas.openxmlformats.org/drawingml/2006/main" xmlns:pic="http://schemas.openxmlformats.org/drawingml/2006/picture">
-            <wp:extent cx="5486400" cy="3429000"/>
-            <wp:docPr id="6" name="Picture 6"/>
+            <wp:extent cx="5486400" cy="2737425"/>
+            <wp:docPr id="9" name="Picture 9"/>
             <wp:cNvGraphicFramePr>
               <a:graphicFrameLocks noChangeAspect="1"/>
             </wp:cNvGraphicFramePr>
@@ -2749,11 +3233,11 @@
               <a:graphicData uri="http://schemas.openxmlformats.org/drawingml/2006/picture">
                 <pic:pic>
                   <pic:nvPicPr>
-                    <pic:cNvPr id="0" name="17_text_tree.png"/>
+                    <pic:cNvPr id="0" name="27_folder_multiselect.png"/>
                     <pic:cNvPicPr/>
                   </pic:nvPicPr>
                   <pic:blipFill>
-                    <a:blip r:embed="rId14"/>
+                    <a:blip r:embed="rId17"/>
                     <a:stretch>
                       <a:fillRect/>
                     </a:stretch>
@@ -2761,7 +3245,7 @@
                   <pic:spPr>
                     <a:xfrm>
                       <a:off x="0" y="0"/>
-                      <a:ext cx="5486400" cy="3429000"/>
+                      <a:ext cx="5486400" cy="2737425"/>
                     </a:xfrm>
                     <a:prstGeom prst="rect"/>
                   </pic:spPr>
@@ -2783,7 +3267,7 @@
           <w:color w:val="707070"/>
           <w:sz w:val="18"/>
         </w:rPr>
-        <w:t>图 3-4　文本树预览窗口</w:t>
+        <w:t>图 3-6　文件夹多选模式：已勾选 1 个文件夹，可批量下载或删除</w:t>
       </w:r>
     </w:p>
     <w:p/>
@@ -3337,6 +3821,27 @@
     </w:p>
     <w:p>
       <w:pPr>
+        <w:ind w:left="576" w:right="576"/>
+        <w:shd w:val="clear" w:color="auto" w:fill="E6F4EA"/>
+      </w:pPr>
+      <w:r>
+        <w:rPr>
+          <w:rFonts w:ascii="Microsoft YaHei" w:hAnsi="Microsoft YaHei" w:eastAsia="Microsoft YaHei"/>
+          <w:b/>
+          <w:color w:val="056F00"/>
+        </w:rPr>
+        <w:t>提示：</w:t>
+      </w:r>
+      <w:r>
+        <w:rPr>
+          <w:rFonts w:ascii="Microsoft YaHei" w:hAnsi="Microsoft YaHei" w:eastAsia="Microsoft YaHei"/>
+          <w:color w:val="333333"/>
+        </w:rPr>
+        <w:t>更快的做法：直接把文档卡片拖到左侧树形导航中的目标文件夹上，松手即可完成关联，效果与上述步骤完全相同，只是不用先打开选择器。</w:t>
+      </w:r>
+    </w:p>
+    <w:p>
+      <w:pPr>
         <w:pStyle w:val="Heading2"/>
       </w:pPr>
       <w:r>
@@ -3366,7 +3871,7 @@
         <w:rPr>
           <w:rFonts w:ascii="Microsoft YaHei" w:hAnsi="Microsoft YaHei" w:eastAsia="Microsoft YaHei"/>
         </w:rPr>
-        <w:t>查看器以弹窗形式打开，主体显示文档预览。</w:t>
+        <w:t>查看器以弹窗形式打开，主体显示文档预览；窗口边框可拖动调整大小，标题栏可拖动移动位置，也可单击【弹出文档】把查看器变成一个独立的浏览器窗口（例如拖到另一个显示器上），预览区与右侧信息栏之间的分隔线同样可以拖动调整宽度。</w:t>
       </w:r>
     </w:p>
     <w:p>
@@ -3425,7 +3930,7 @@
         <w:rPr>
           <w:rFonts w:ascii="Microsoft YaHei" w:hAnsi="Microsoft YaHei" w:eastAsia="Microsoft YaHei"/>
         </w:rPr>
-        <w:t>查看器顶部有【添加描述】【查看地图位置】【提取文字（OCR）】【提取关键参数】【扫描条码】（见第 4.8 节）【提问 AI】（需先配置 API Key，见第 3.5 节）【下载】【关闭】等操作按钮。</w:t>
+        <w:t>查看器顶部有【添加描述】【查看地图位置】【提取文字（OCR）】【提取关键参数】【扫描条码】（见第 4.8 节）【提问 AI】（见第 4.9 节，需先配置 API Key，见第 6.4 节）【下载】【弹出文档】【关闭】等操作按钮。</w:t>
       </w:r>
     </w:p>
     <w:p>
@@ -3447,7 +3952,7 @@
         <w:drawing>
           <wp:inline xmlns:a="http://schemas.openxmlformats.org/drawingml/2006/main" xmlns:pic="http://schemas.openxmlformats.org/drawingml/2006/picture">
             <wp:extent cx="5486400" cy="3429000"/>
-            <wp:docPr id="7" name="Picture 7"/>
+            <wp:docPr id="10" name="Picture 10"/>
             <wp:cNvGraphicFramePr>
               <a:graphicFrameLocks noChangeAspect="1"/>
             </wp:cNvGraphicFramePr>
@@ -3459,7 +3964,7 @@
                     <pic:cNvPicPr/>
                   </pic:nvPicPr>
                   <pic:blipFill>
-                    <a:blip r:embed="rId15"/>
+                    <a:blip r:embed="rId18"/>
                     <a:stretch>
                       <a:fillRect/>
                     </a:stretch>
@@ -3501,7 +4006,7 @@
         <w:drawing>
           <wp:inline xmlns:a="http://schemas.openxmlformats.org/drawingml/2006/main" xmlns:pic="http://schemas.openxmlformats.org/drawingml/2006/picture">
             <wp:extent cx="5486400" cy="3429000"/>
-            <wp:docPr id="8" name="Picture 8"/>
+            <wp:docPr id="11" name="Picture 11"/>
             <wp:cNvGraphicFramePr>
               <a:graphicFrameLocks noChangeAspect="1"/>
             </wp:cNvGraphicFramePr>
@@ -3513,7 +4018,7 @@
                     <pic:cNvPicPr/>
                   </pic:nvPicPr>
                   <pic:blipFill>
-                    <a:blip r:embed="rId16"/>
+                    <a:blip r:embed="rId19"/>
                     <a:stretch>
                       <a:fillRect/>
                     </a:stretch>
@@ -3547,6 +4052,81 @@
       </w:r>
     </w:p>
     <w:p/>
+    <w:p>
+      <w:pPr>
+        <w:jc w:val="center"/>
+      </w:pPr>
+      <w:r>
+        <w:drawing>
+          <wp:inline xmlns:a="http://schemas.openxmlformats.org/drawingml/2006/main" xmlns:pic="http://schemas.openxmlformats.org/drawingml/2006/picture">
+            <wp:extent cx="5486400" cy="2741275"/>
+            <wp:docPr id="12" name="Picture 12"/>
+            <wp:cNvGraphicFramePr>
+              <a:graphicFrameLocks noChangeAspect="1"/>
+            </wp:cNvGraphicFramePr>
+            <a:graphic>
+              <a:graphicData uri="http://schemas.openxmlformats.org/drawingml/2006/picture">
+                <pic:pic>
+                  <pic:nvPicPr>
+                    <pic:cNvPr id="0" name="28_doc_viewer_popout.png"/>
+                    <pic:cNvPicPr/>
+                  </pic:nvPicPr>
+                  <pic:blipFill>
+                    <a:blip r:embed="rId20"/>
+                    <a:stretch>
+                      <a:fillRect/>
+                    </a:stretch>
+                  </pic:blipFill>
+                  <pic:spPr>
+                    <a:xfrm>
+                      <a:off x="0" y="0"/>
+                      <a:ext cx="5486400" cy="2741275"/>
+                    </a:xfrm>
+                    <a:prstGeom prst="rect"/>
+                  </pic:spPr>
+                </pic:pic>
+              </a:graphicData>
+            </a:graphic>
+          </wp:inline>
+        </w:drawing>
+      </w:r>
+    </w:p>
+    <w:p>
+      <w:pPr>
+        <w:jc w:val="center"/>
+      </w:pPr>
+      <w:r>
+        <w:rPr>
+          <w:rFonts w:ascii="Microsoft YaHei" w:hAnsi="Microsoft YaHei" w:eastAsia="Microsoft YaHei"/>
+          <w:i/>
+          <w:color w:val="707070"/>
+          <w:sz w:val="18"/>
+        </w:rPr>
+        <w:t>图 4-3　查看器顶部工具栏：提取关键参数、扫描条码、提问 AI、弹出文档等按钮</w:t>
+      </w:r>
+    </w:p>
+    <w:p/>
+    <w:p>
+      <w:pPr>
+        <w:ind w:left="576" w:right="576"/>
+        <w:shd w:val="clear" w:color="auto" w:fill="E6F4EA"/>
+      </w:pPr>
+      <w:r>
+        <w:rPr>
+          <w:rFonts w:ascii="Microsoft YaHei" w:hAnsi="Microsoft YaHei" w:eastAsia="Microsoft YaHei"/>
+          <w:b/>
+          <w:color w:val="056F00"/>
+        </w:rPr>
+        <w:t>提示：</w:t>
+      </w:r>
+      <w:r>
+        <w:rPr>
+          <w:rFonts w:ascii="Microsoft YaHei" w:hAnsi="Microsoft YaHei" w:eastAsia="Microsoft YaHei"/>
+          <w:color w:val="333333"/>
+        </w:rPr>
+        <w:t>打开过的文档，在其所在文件夹的列表中会保持高亮显示，回来时一眼就能找到"刚才看的是哪一份"，不用凭记忆逐个再找一遍。</w:t>
+      </w:r>
+    </w:p>
     <w:p>
       <w:pPr>
         <w:pStyle w:val="Heading2"/>
@@ -3889,7 +4469,7 @@
         <w:drawing>
           <wp:inline xmlns:a="http://schemas.openxmlformats.org/drawingml/2006/main" xmlns:pic="http://schemas.openxmlformats.org/drawingml/2006/picture">
             <wp:extent cx="5486400" cy="2253343"/>
-            <wp:docPr id="9" name="Picture 9"/>
+            <wp:docPr id="13" name="Picture 13"/>
             <wp:cNvGraphicFramePr>
               <a:graphicFrameLocks noChangeAspect="1"/>
             </wp:cNvGraphicFramePr>
@@ -3901,7 +4481,7 @@
                     <pic:cNvPicPr/>
                   </pic:nvPicPr>
                   <pic:blipFill>
-                    <a:blip r:embed="rId17"/>
+                    <a:blip r:embed="rId21"/>
                     <a:stretch>
                       <a:fillRect/>
                     </a:stretch>
@@ -3931,7 +4511,7 @@
           <w:color w:val="707070"/>
           <w:sz w:val="18"/>
         </w:rPr>
-        <w:t>图 4-3　扫描条码：识别成功后的提示</w:t>
+        <w:t>图 4-4　扫描条码：识别成功后的提示</w:t>
       </w:r>
     </w:p>
     <w:p/>
@@ -3974,6 +4554,306 @@
           <w:rFonts w:ascii="Microsoft YaHei" w:hAnsi="Microsoft YaHei" w:eastAsia="Microsoft YaHei"/>
         </w:rPr>
         <w:t>本功能完全离线运行（基于开源的 zbar 库），不上传任何数据，也不需要配置 AI Key，但对图片质量有一定要求：条码需清晰、无遮挡，且条码四周需留有足够的空白边框（"静区"）。手机截图分享出来的二维码（例如微信"扫码入群"图片）常常因为中间嵌有较大的图标、或背景色直接顶到条码边缘而无法识别——这类图片通常只有微信自己的扫一扫或手机相机能读取，属于本功能的已知局限，并非软件故障。</w:t>
+      </w:r>
+    </w:p>
+    <w:p>
+      <w:pPr>
+        <w:pStyle w:val="Heading2"/>
+      </w:pPr>
+      <w:r>
+        <w:rPr>
+          <w:rFonts w:ascii="Microsoft YaHei" w:hAnsi="Microsoft YaHei" w:eastAsia="Microsoft YaHei"/>
+          <w:color w:val="1D4E89"/>
+        </w:rPr>
+        <w:t>4.9  就单个文档提问 AI，或一键润色</w:t>
+      </w:r>
+    </w:p>
+    <w:p>
+      <w:r>
+        <w:rPr>
+          <w:rFonts w:ascii="Microsoft YaHei" w:hAnsi="Microsoft YaHei" w:eastAsia="Microsoft YaHei"/>
+        </w:rPr>
+        <w:t>除了第 18 章介绍的"对整个文件夹提问 AI"（一次读取多份文档），打开单份文档的查看器后，也可以直接针对这一份文档提问：</w:t>
+      </w:r>
+    </w:p>
+    <w:p>
+      <w:pPr>
+        <w:pStyle w:val="ListNumber"/>
+      </w:pPr>
+      <w:r>
+        <w:rPr>
+          <w:rFonts w:ascii="Microsoft YaHei" w:hAnsi="Microsoft YaHei" w:eastAsia="Microsoft YaHei"/>
+        </w:rPr>
+        <w:t>打开文档查看器，单击顶部的【提问 AI】按钮。</w:t>
+      </w:r>
+    </w:p>
+    <w:p>
+      <w:pPr>
+        <w:pStyle w:val="ListNumber"/>
+      </w:pPr>
+      <w:r>
+        <w:rPr>
+          <w:rFonts w:ascii="Microsoft YaHei" w:hAnsi="Microsoft YaHei" w:eastAsia="Microsoft YaHei"/>
+        </w:rPr>
+        <w:t>右侧展开提问面板；AI 会依据该文档已提取的文字（OCR）、描述、关键参数作答。</w:t>
+      </w:r>
+    </w:p>
+    <w:p>
+      <w:pPr>
+        <w:pStyle w:val="ListNumber"/>
+      </w:pPr>
+      <w:r>
+        <w:rPr>
+          <w:rFonts w:ascii="Microsoft YaHei" w:hAnsi="Microsoft YaHei" w:eastAsia="Microsoft YaHei"/>
+        </w:rPr>
+        <w:t>在文本框中输入问题（或单击麦克风图标语音输入），单击【发送】，或按 Ctrl/Cmd+Enter。</w:t>
+      </w:r>
+    </w:p>
+    <w:p>
+      <w:pPr>
+        <w:pStyle w:val="ListNumber"/>
+      </w:pPr>
+      <w:r>
+        <w:rPr>
+          <w:rFonts w:ascii="Microsoft YaHei" w:hAnsi="Microsoft YaHei" w:eastAsia="Microsoft YaHei"/>
+        </w:rPr>
+        <w:t>答案显示在下方，并连同问题一起追加保存到该文档所在文件夹的一份问答记录文档中，方便以后回看。</w:t>
+      </w:r>
+    </w:p>
+    <w:p>
+      <w:pPr>
+        <w:jc w:val="center"/>
+      </w:pPr>
+      <w:r>
+        <w:drawing>
+          <wp:inline xmlns:a="http://schemas.openxmlformats.org/drawingml/2006/main" xmlns:pic="http://schemas.openxmlformats.org/drawingml/2006/picture">
+            <wp:extent cx="5486400" cy="2741275"/>
+            <wp:docPr id="14" name="Picture 14"/>
+            <wp:cNvGraphicFramePr>
+              <a:graphicFrameLocks noChangeAspect="1"/>
+            </wp:cNvGraphicFramePr>
+            <a:graphic>
+              <a:graphicData uri="http://schemas.openxmlformats.org/drawingml/2006/picture">
+                <pic:pic>
+                  <pic:nvPicPr>
+                    <pic:cNvPr id="0" name="30_doc_ask_ai.png"/>
+                    <pic:cNvPicPr/>
+                  </pic:nvPicPr>
+                  <pic:blipFill>
+                    <a:blip r:embed="rId22"/>
+                    <a:stretch>
+                      <a:fillRect/>
+                    </a:stretch>
+                  </pic:blipFill>
+                  <pic:spPr>
+                    <a:xfrm>
+                      <a:off x="0" y="0"/>
+                      <a:ext cx="5486400" cy="2741275"/>
+                    </a:xfrm>
+                    <a:prstGeom prst="rect"/>
+                  </pic:spPr>
+                </pic:pic>
+              </a:graphicData>
+            </a:graphic>
+          </wp:inline>
+        </w:drawing>
+      </w:r>
+    </w:p>
+    <w:p>
+      <w:pPr>
+        <w:jc w:val="center"/>
+      </w:pPr>
+      <w:r>
+        <w:rPr>
+          <w:rFonts w:ascii="Microsoft YaHei" w:hAnsi="Microsoft YaHei" w:eastAsia="Microsoft YaHei"/>
+          <w:i/>
+          <w:color w:val="707070"/>
+          <w:sz w:val="18"/>
+        </w:rPr>
+        <w:t>图 4-5　就单个文档提问 AI（需先配置 Gemini 或 DeepSeek 的 API Key，见第 6.4 节）</w:t>
+      </w:r>
+    </w:p>
+    <w:p/>
+    <w:p>
+      <w:r>
+        <w:rPr>
+          <w:rFonts w:ascii="Microsoft YaHei" w:hAnsi="Microsoft YaHei" w:eastAsia="Microsoft YaHei"/>
+        </w:rPr>
+        <w:t>描述面板里的【AI 整理】按钮同理可用于单份文档的描述：选择"整理结构 / 润色文字 / 精简概括"三种方式之一，AI 会在保留信息的前提下把随手写的文字整理通顺，结果先预览，单击【应用】才会替换原文。</w:t>
+      </w:r>
+    </w:p>
+    <w:p>
+      <w:pPr>
+        <w:pStyle w:val="Heading2"/>
+      </w:pPr>
+      <w:r>
+        <w:rPr>
+          <w:rFonts w:ascii="Microsoft YaHei" w:hAnsi="Microsoft YaHei" w:eastAsia="Microsoft YaHei"/>
+          <w:color w:val="1D4E89"/>
+        </w:rPr>
+        <w:t>4.10  转换为 PDF（批量）</w:t>
+      </w:r>
+    </w:p>
+    <w:p>
+      <w:r>
+        <w:rPr>
+          <w:rFonts w:ascii="Microsoft YaHei" w:hAnsi="Microsoft YaHei" w:eastAsia="Microsoft YaHei"/>
+        </w:rPr>
+        <w:t>需要把一批照片或已有的 PDF 统一转换、规范命名时，不用逐份另存。</w:t>
+      </w:r>
+    </w:p>
+    <w:p>
+      <w:pPr>
+        <w:pStyle w:val="ListNumber"/>
+      </w:pPr>
+      <w:r>
+        <w:rPr>
+          <w:rFonts w:ascii="Microsoft YaHei" w:hAnsi="Microsoft YaHei" w:eastAsia="Microsoft YaHei"/>
+        </w:rPr>
+        <w:t>在文件夹中勾选要转换的图片和/或 PDF 文档（工具栏【转换为 PDF】按钮旁通常先要通过【多选】勾选，或在弹出的对话框内勾选）。</w:t>
+      </w:r>
+    </w:p>
+    <w:p>
+      <w:pPr>
+        <w:pStyle w:val="ListNumber"/>
+      </w:pPr>
+      <w:r>
+        <w:rPr>
+          <w:rFonts w:ascii="Microsoft YaHei" w:hAnsi="Microsoft YaHei" w:eastAsia="Microsoft YaHei"/>
+        </w:rPr>
+        <w:t>单击【转换为 PDF】，弹出的对话框会列出已勾选的文档及其大小。</w:t>
+      </w:r>
+    </w:p>
+    <w:p>
+      <w:pPr>
+        <w:pStyle w:val="ListNumber"/>
+      </w:pPr>
+      <w:r>
+        <w:rPr>
+          <w:rFonts w:ascii="Microsoft YaHei" w:hAnsi="Microsoft YaHei" w:eastAsia="Microsoft YaHei"/>
+        </w:rPr>
+        <w:t>单击【将 N 份文档转换为 PDF】。</w:t>
+      </w:r>
+    </w:p>
+    <w:p>
+      <w:pPr>
+        <w:pStyle w:val="ListNumber"/>
+      </w:pPr>
+      <w:r>
+        <w:rPr>
+          <w:rFonts w:ascii="Microsoft YaHei" w:hAnsi="Microsoft YaHei" w:eastAsia="Microsoft YaHei"/>
+        </w:rPr>
+        <w:t>每份文档被分别转换为独立的 PDF（如果能确定日期，文件名以"YYYY-MM-DD-"开头），原始文件则移入"已删除文件"（软删除，可找回，见第 3.2 节）。</w:t>
+      </w:r>
+    </w:p>
+    <w:p>
+      <w:pPr>
+        <w:jc w:val="center"/>
+      </w:pPr>
+      <w:r>
+        <w:drawing>
+          <wp:inline xmlns:a="http://schemas.openxmlformats.org/drawingml/2006/main" xmlns:pic="http://schemas.openxmlformats.org/drawingml/2006/picture">
+            <wp:extent cx="5486400" cy="2741275"/>
+            <wp:docPr id="15" name="Picture 15"/>
+            <wp:cNvGraphicFramePr>
+              <a:graphicFrameLocks noChangeAspect="1"/>
+            </wp:cNvGraphicFramePr>
+            <a:graphic>
+              <a:graphicData uri="http://schemas.openxmlformats.org/drawingml/2006/picture">
+                <pic:pic>
+                  <pic:nvPicPr>
+                    <pic:cNvPr id="0" name="33_convert_to_pdf.png"/>
+                    <pic:cNvPicPr/>
+                  </pic:nvPicPr>
+                  <pic:blipFill>
+                    <a:blip r:embed="rId23"/>
+                    <a:stretch>
+                      <a:fillRect/>
+                    </a:stretch>
+                  </pic:blipFill>
+                  <pic:spPr>
+                    <a:xfrm>
+                      <a:off x="0" y="0"/>
+                      <a:ext cx="5486400" cy="2741275"/>
+                    </a:xfrm>
+                    <a:prstGeom prst="rect"/>
+                  </pic:spPr>
+                </pic:pic>
+              </a:graphicData>
+            </a:graphic>
+          </wp:inline>
+        </w:drawing>
+      </w:r>
+    </w:p>
+    <w:p>
+      <w:pPr>
+        <w:jc w:val="center"/>
+      </w:pPr>
+      <w:r>
+        <w:rPr>
+          <w:rFonts w:ascii="Microsoft YaHei" w:hAnsi="Microsoft YaHei" w:eastAsia="Microsoft YaHei"/>
+          <w:i/>
+          <w:color w:val="707070"/>
+          <w:sz w:val="18"/>
+        </w:rPr>
+        <w:t>图 4-6　转换为 PDF 对话框：已选中 1 份文档</w:t>
+      </w:r>
+    </w:p>
+    <w:p/>
+    <w:p>
+      <w:pPr>
+        <w:pStyle w:val="Heading2"/>
+      </w:pPr>
+      <w:r>
+        <w:rPr>
+          <w:rFonts w:ascii="Microsoft YaHei" w:hAnsi="Microsoft YaHei" w:eastAsia="Microsoft YaHei"/>
+          <w:color w:val="1D4E89"/>
+        </w:rPr>
+        <w:t>4.11  磁盘文件名与误删恢复</w:t>
+      </w:r>
+    </w:p>
+    <w:p>
+      <w:r>
+        <w:rPr>
+          <w:rFonts w:ascii="Microsoft YaHei" w:hAnsi="Microsoft YaHei" w:eastAsia="Microsoft YaHei"/>
+        </w:rPr>
+        <w:t>这两点属于底层改进，无需手动操作，但了解一下有助于日后在系统文件管理器里查找文件、或排查问题：</w:t>
+      </w:r>
+    </w:p>
+    <w:p>
+      <w:pPr>
+        <w:pStyle w:val="ListBullet"/>
+        <w:ind w:left="360"/>
+      </w:pPr>
+      <w:r>
+        <w:rPr>
+          <w:rFonts w:ascii="Microsoft YaHei" w:hAnsi="Microsoft YaHei" w:eastAsia="Microsoft YaHei"/>
+        </w:rPr>
+        <w:t>硬盘上保存的实际文件名已从"编号在前"改成"名字在前"（例如 体检报告+DOC-20260920-xxx.pdf），直接在 Finder / 资源管理器里翻文件夹时，一眼就能看出是什么文档，不用先点开才知道。</w:t>
+      </w:r>
+    </w:p>
+    <w:p>
+      <w:pPr>
+        <w:pStyle w:val="ListBullet"/>
+        <w:ind w:left="360"/>
+      </w:pPr>
+      <w:r>
+        <w:rPr>
+          <w:rFonts w:ascii="Microsoft YaHei" w:hAnsi="Microsoft YaHei" w:eastAsia="Microsoft YaHei"/>
+        </w:rPr>
+        <w:t>上传失败时会给出具体原因（例如磁盘空间不足、没有写入权限），不会再是一个看不出原因的"500 错误"。</w:t>
+      </w:r>
+    </w:p>
+    <w:p>
+      <w:pPr>
+        <w:pStyle w:val="ListBullet"/>
+        <w:ind w:left="360"/>
+      </w:pPr>
+      <w:r>
+        <w:rPr>
+          <w:rFonts w:ascii="Microsoft YaHei" w:hAnsi="Microsoft YaHei" w:eastAsia="Microsoft YaHei"/>
+        </w:rPr>
+        <w:t>每次修改项目的文件夹结构（增删文件夹、移动、批量操作等）之前，系统都会自动先保存一份当时的快照；万一某次改动把结构弄乱了，可以借助该快照恢复到之前的状态——这是一层后台自动运行的安全网，正常使用中不会看到任何界面。</w:t>
       </w:r>
     </w:p>
     <w:p>
@@ -4759,7 +5639,7 @@
         <w:drawing>
           <wp:inline xmlns:a="http://schemas.openxmlformats.org/drawingml/2006/main" xmlns:pic="http://schemas.openxmlformats.org/drawingml/2006/picture">
             <wp:extent cx="5486400" cy="3429000"/>
-            <wp:docPr id="10" name="Picture 10"/>
+            <wp:docPr id="16" name="Picture 16"/>
             <wp:cNvGraphicFramePr>
               <a:graphicFrameLocks noChangeAspect="1"/>
             </wp:cNvGraphicFramePr>
@@ -4771,7 +5651,7 @@
                     <pic:cNvPicPr/>
                   </pic:nvPicPr>
                   <pic:blipFill>
-                    <a:blip r:embed="rId18"/>
+                    <a:blip r:embed="rId24"/>
                     <a:stretch>
                       <a:fillRect/>
                     </a:stretch>
@@ -4806,6 +5686,272 @@
     </w:p>
     <w:p/>
     <w:p>
+      <w:pPr>
+        <w:pStyle w:val="Heading2"/>
+      </w:pPr>
+      <w:r>
+        <w:rPr>
+          <w:rFonts w:ascii="Microsoft YaHei" w:hAnsi="Microsoft YaHei" w:eastAsia="Microsoft YaHei"/>
+          <w:color w:val="1D4E89"/>
+        </w:rPr>
+        <w:t>6.4  配置 AI 服务商（Gemini / DeepSeek）</w:t>
+      </w:r>
+    </w:p>
+    <w:p>
+      <w:r>
+        <w:rPr>
+          <w:rFonts w:ascii="Microsoft YaHei" w:hAnsi="Microsoft YaHei" w:eastAsia="Microsoft YaHei"/>
+        </w:rPr>
+        <w:t>AI 辅助提取关键参数、文档与文件夹的"提问 AI"、描述面板的"AI 整理"与"检查错别字"，都依赖同一套 API Key 设置，二选一或两个都配置均可：</w:t>
+      </w:r>
+    </w:p>
+    <w:p>
+      <w:pPr>
+        <w:pStyle w:val="ListNumber"/>
+      </w:pPr>
+      <w:r>
+        <w:rPr>
+          <w:rFonts w:ascii="Microsoft YaHei" w:hAnsi="Microsoft YaHei" w:eastAsia="Microsoft YaHei"/>
+        </w:rPr>
+        <w:t>在任意一处出现【配置 AI（Gemini）】链接的地方单击它（描述面板、提问 AI 面板、关键参数提取面板等入口相同），弹出【AI 提供商设置】对话框。</w:t>
+      </w:r>
+    </w:p>
+    <w:p>
+      <w:pPr>
+        <w:pStyle w:val="ListNumber"/>
+      </w:pPr>
+      <w:r>
+        <w:rPr>
+          <w:rFonts w:ascii="Microsoft YaHei" w:hAnsi="Microsoft YaHei" w:eastAsia="Microsoft YaHei"/>
+        </w:rPr>
+        <w:t>粘贴您自己的 Google Gemini 或 DeepSeek API Key，单击对应的【保存】。</w:t>
+      </w:r>
+    </w:p>
+    <w:p>
+      <w:pPr>
+        <w:pStyle w:val="ListNumber"/>
+      </w:pPr>
+      <w:r>
+        <w:rPr>
+          <w:rFonts w:ascii="Microsoft YaHei" w:hAnsi="Microsoft YaHei" w:eastAsia="Microsoft YaHei"/>
+        </w:rPr>
+        <w:t>两个服务商的 Key 完全独立保存、互不影响；同时配置两个时，各功能面板通常默认优先使用 Gemini，缺失时自动改用 DeepSeek。</w:t>
+      </w:r>
+    </w:p>
+    <w:p>
+      <w:pPr>
+        <w:jc w:val="center"/>
+      </w:pPr>
+      <w:r>
+        <w:drawing>
+          <wp:inline xmlns:a="http://schemas.openxmlformats.org/drawingml/2006/main" xmlns:pic="http://schemas.openxmlformats.org/drawingml/2006/picture">
+            <wp:extent cx="5486400" cy="2741275"/>
+            <wp:docPr id="17" name="Picture 17"/>
+            <wp:cNvGraphicFramePr>
+              <a:graphicFrameLocks noChangeAspect="1"/>
+            </wp:cNvGraphicFramePr>
+            <a:graphic>
+              <a:graphicData uri="http://schemas.openxmlformats.org/drawingml/2006/picture">
+                <pic:pic>
+                  <pic:nvPicPr>
+                    <pic:cNvPr id="0" name="32_ai_provider_settings.png"/>
+                    <pic:cNvPicPr/>
+                  </pic:nvPicPr>
+                  <pic:blipFill>
+                    <a:blip r:embed="rId25"/>
+                    <a:stretch>
+                      <a:fillRect/>
+                    </a:stretch>
+                  </pic:blipFill>
+                  <pic:spPr>
+                    <a:xfrm>
+                      <a:off x="0" y="0"/>
+                      <a:ext cx="5486400" cy="2741275"/>
+                    </a:xfrm>
+                    <a:prstGeom prst="rect"/>
+                  </pic:spPr>
+                </pic:pic>
+              </a:graphicData>
+            </a:graphic>
+          </wp:inline>
+        </w:drawing>
+      </w:r>
+    </w:p>
+    <w:p>
+      <w:pPr>
+        <w:jc w:val="center"/>
+      </w:pPr>
+      <w:r>
+        <w:rPr>
+          <w:rFonts w:ascii="Microsoft YaHei" w:hAnsi="Microsoft YaHei" w:eastAsia="Microsoft YaHei"/>
+          <w:i/>
+          <w:color w:val="707070"/>
+          <w:sz w:val="18"/>
+        </w:rPr>
+        <w:t>图 6-2　AI 提供商设置：Gemini 与 DeepSeek 分别配置</w:t>
+      </w:r>
+    </w:p>
+    <w:p/>
+    <w:p>
+      <w:pPr>
+        <w:ind w:left="576" w:right="576"/>
+        <w:shd w:val="clear" w:color="auto" w:fill="FFF8E1"/>
+      </w:pPr>
+      <w:r>
+        <w:rPr>
+          <w:rFonts w:ascii="Microsoft YaHei" w:hAnsi="Microsoft YaHei" w:eastAsia="Microsoft YaHei"/>
+          <w:b/>
+          <w:color w:val="924E00"/>
+        </w:rPr>
+        <w:t>注意：</w:t>
+      </w:r>
+      <w:r>
+        <w:rPr>
+          <w:rFonts w:ascii="Microsoft YaHei" w:hAnsi="Microsoft YaHei" w:eastAsia="Microsoft YaHei"/>
+        </w:rPr>
+        <w:t>这些 AI 功能默认关闭，且需要联网；不配置任何 Key 时，DMS 的全部核心功能（文件夹管理、上传、OCR、条码、搜索等）完全离线运行，不受影响。Key 只保存在本机（服务器本地文件），不会上传到 DMS 官方或任何第三方服务器。</w:t>
+      </w:r>
+    </w:p>
+    <w:p>
+      <w:pPr>
+        <w:pStyle w:val="Heading2"/>
+      </w:pPr>
+      <w:r>
+        <w:rPr>
+          <w:rFonts w:ascii="Microsoft YaHei" w:hAnsi="Microsoft YaHei" w:eastAsia="Microsoft YaHei"/>
+          <w:color w:val="1D4E89"/>
+        </w:rPr>
+        <w:t>6.5  参数-时间趋势图与保存快照</w:t>
+      </w:r>
+    </w:p>
+    <w:p>
+      <w:r>
+        <w:rPr>
+          <w:rFonts w:ascii="Microsoft YaHei" w:hAnsi="Microsoft YaHei" w:eastAsia="Microsoft YaHei"/>
+        </w:rPr>
+        <w:t>把某个关键参数的数值随时间变化画成图表，适合追踪血压、余额、库存、检测读数这类需要"多次记录、看长期变化"的数字。</w:t>
+      </w:r>
+    </w:p>
+    <w:p>
+      <w:pPr>
+        <w:pStyle w:val="ListNumber"/>
+      </w:pPr>
+      <w:r>
+        <w:rPr>
+          <w:rFonts w:ascii="Microsoft YaHei" w:hAnsi="Microsoft YaHei" w:eastAsia="Microsoft YaHei"/>
+        </w:rPr>
+        <w:t>选中一个文件夹，单击工具栏的【趋势图】按钮。</w:t>
+      </w:r>
+    </w:p>
+    <w:p>
+      <w:pPr>
+        <w:pStyle w:val="ListNumber"/>
+      </w:pPr>
+      <w:r>
+        <w:rPr>
+          <w:rFonts w:ascii="Microsoft YaHei" w:hAnsi="Microsoft YaHei" w:eastAsia="Microsoft YaHei"/>
+        </w:rPr>
+        <w:t>在【参数】下拉框中选择要绘制的关键参数（只列出该文件夹及其子文件夹中出现过数值的参数）；可选择按折线或柱状显示，横轴可选"文档日期"等字段，"包含子文件夹"决定是否把子文件夹里的文档也算进来。</w:t>
+      </w:r>
+    </w:p>
+    <w:p>
+      <w:pPr>
+        <w:jc w:val="center"/>
+      </w:pPr>
+      <w:r>
+        <w:drawing>
+          <wp:inline xmlns:a="http://schemas.openxmlformats.org/drawingml/2006/main" xmlns:pic="http://schemas.openxmlformats.org/drawingml/2006/picture">
+            <wp:extent cx="5486400" cy="2741275"/>
+            <wp:docPr id="18" name="Picture 18"/>
+            <wp:cNvGraphicFramePr>
+              <a:graphicFrameLocks noChangeAspect="1"/>
+            </wp:cNvGraphicFramePr>
+            <a:graphic>
+              <a:graphicData uri="http://schemas.openxmlformats.org/drawingml/2006/picture">
+                <pic:pic>
+                  <pic:nvPicPr>
+                    <pic:cNvPr id="0" name="29_trend_chart.png"/>
+                    <pic:cNvPicPr/>
+                  </pic:nvPicPr>
+                  <pic:blipFill>
+                    <a:blip r:embed="rId26"/>
+                    <a:stretch>
+                      <a:fillRect/>
+                    </a:stretch>
+                  </pic:blipFill>
+                  <pic:spPr>
+                    <a:xfrm>
+                      <a:off x="0" y="0"/>
+                      <a:ext cx="5486400" cy="2741275"/>
+                    </a:xfrm>
+                    <a:prstGeom prst="rect"/>
+                  </pic:spPr>
+                </pic:pic>
+              </a:graphicData>
+            </a:graphic>
+          </wp:inline>
+        </w:drawing>
+      </w:r>
+    </w:p>
+    <w:p>
+      <w:pPr>
+        <w:jc w:val="center"/>
+      </w:pPr>
+      <w:r>
+        <w:rPr>
+          <w:rFonts w:ascii="Microsoft YaHei" w:hAnsi="Microsoft YaHei" w:eastAsia="Microsoft YaHei"/>
+          <w:i/>
+          <w:color w:val="707070"/>
+          <w:sz w:val="18"/>
+        </w:rPr>
+        <w:t>图 6-3　趋势图窗口（此文件夹尚无数值型参数，选定参数后会显示折线/柱状图）</w:t>
+      </w:r>
+    </w:p>
+    <w:p/>
+    <w:p>
+      <w:pPr>
+        <w:pStyle w:val="ListNumber"/>
+      </w:pPr>
+      <w:r>
+        <w:rPr>
+          <w:rFonts w:ascii="Microsoft YaHei" w:hAnsi="Microsoft YaHei" w:eastAsia="Microsoft YaHei"/>
+        </w:rPr>
+        <w:t>图表窗口同文档查看器一样，可拖动、可拉伸边框调整大小，也可单击弹出为独立窗口；坐标轴的显示范围也可以手动指定，不必只看自动生成的范围。</w:t>
+      </w:r>
+    </w:p>
+    <w:p>
+      <w:pPr>
+        <w:pStyle w:val="ListNumber"/>
+      </w:pPr>
+      <w:r>
+        <w:rPr>
+          <w:rFonts w:ascii="Microsoft YaHei" w:hAnsi="Microsoft YaHei" w:eastAsia="Microsoft YaHei"/>
+        </w:rPr>
+        <w:t>对某个参数满意后，单击【保存快照】——DMS 会把该参数当前的合计/最新值存进一份"XX 历史.xlsx"文档里；多存几次快照后，即可直接看到"数值随时间变化"的趋势线。</w:t>
+      </w:r>
+    </w:p>
+    <w:p>
+      <w:pPr>
+        <w:ind w:left="576" w:right="576"/>
+        <w:shd w:val="clear" w:color="auto" w:fill="E6F4EA"/>
+      </w:pPr>
+      <w:r>
+        <w:rPr>
+          <w:rFonts w:ascii="Microsoft YaHei" w:hAnsi="Microsoft YaHei" w:eastAsia="Microsoft YaHei"/>
+          <w:b/>
+          <w:color w:val="056F00"/>
+        </w:rPr>
+        <w:t>提示：</w:t>
+      </w:r>
+      <w:r>
+        <w:rPr>
+          <w:rFonts w:ascii="Microsoft YaHei" w:hAnsi="Microsoft YaHei" w:eastAsia="Microsoft YaHei"/>
+          <w:color w:val="333333"/>
+        </w:rPr>
+        <w:t>典型用法：每月月底给"银行账户"文件夹的余额参数点一次【保存快照】，攒够几个月后就能画出余额变化的趋势图；血压、体重、库存盘点等场景同理。</w:t>
+      </w:r>
+    </w:p>
+    <w:p>
       <w:r>
         <w:br w:type="page"/>
       </w:r>
@@ -4955,7 +6101,7 @@
         <w:drawing>
           <wp:inline xmlns:a="http://schemas.openxmlformats.org/drawingml/2006/main" xmlns:pic="http://schemas.openxmlformats.org/drawingml/2006/picture">
             <wp:extent cx="5486400" cy="3429000"/>
-            <wp:docPr id="11" name="Picture 11"/>
+            <wp:docPr id="19" name="Picture 19"/>
             <wp:cNvGraphicFramePr>
               <a:graphicFrameLocks noChangeAspect="1"/>
             </wp:cNvGraphicFramePr>
@@ -4967,7 +6113,7 @@
                     <pic:cNvPicPr/>
                   </pic:nvPicPr>
                   <pic:blipFill>
-                    <a:blip r:embed="rId19"/>
+                    <a:blip r:embed="rId27"/>
                     <a:stretch>
                       <a:fillRect/>
                     </a:stretch>
@@ -5193,15 +6339,15 @@
           <w:rFonts w:ascii="Microsoft YaHei" w:hAnsi="Microsoft YaHei" w:eastAsia="Microsoft YaHei"/>
           <w:color w:val="1E40AF"/>
         </w:rPr>
-        <w:t>8  生成数据手册 PDF</w:t>
-      </w:r>
-    </w:p>
-    <w:p>
-      <w:r>
-        <w:rPr>
-          <w:rFonts w:ascii="Microsoft YaHei" w:hAnsi="Microsoft YaHei" w:eastAsia="Microsoft YaHei"/>
-        </w:rPr>
-        <w:t>数据手册功能可将选定的文档合并为一份专业 PDF，包含封面、目录、书签、章节标题和页码。</w:t>
+        <w:t>8  生成数据手册（PDF / Word）</w:t>
+      </w:r>
+    </w:p>
+    <w:p>
+      <w:r>
+        <w:rPr>
+          <w:rFonts w:ascii="Microsoft YaHei" w:hAnsi="Microsoft YaHei" w:eastAsia="Microsoft YaHei"/>
+        </w:rPr>
+        <w:t>数据手册功能可将选定的文档合并为一份专业文档，包含封面、目录、章节标题和页码；提供两种模式——手动勾选文档生成 PDF（8.1–8.2），或按文件夹结构自动生成可编辑的 Word 文档（8.3）。</w:t>
       </w:r>
     </w:p>
     <w:p>
@@ -5213,7 +6359,7 @@
           <w:rFonts w:ascii="Microsoft YaHei" w:hAnsi="Microsoft YaHei" w:eastAsia="Microsoft YaHei"/>
           <w:color w:val="1D4E89"/>
         </w:rPr>
-        <w:t>8.1  选择文档</w:t>
+        <w:t>8.1  选择文档（PDF 模式）</w:t>
       </w:r>
     </w:p>
     <w:p>
@@ -5302,7 +6448,7 @@
         <w:drawing>
           <wp:inline xmlns:a="http://schemas.openxmlformats.org/drawingml/2006/main" xmlns:pic="http://schemas.openxmlformats.org/drawingml/2006/picture">
             <wp:extent cx="5486400" cy="3429000"/>
-            <wp:docPr id="12" name="Picture 12"/>
+            <wp:docPr id="20" name="Picture 20"/>
             <wp:cNvGraphicFramePr>
               <a:graphicFrameLocks noChangeAspect="1"/>
             </wp:cNvGraphicFramePr>
@@ -5314,7 +6460,7 @@
                     <pic:cNvPicPr/>
                   </pic:nvPicPr>
                   <pic:blipFill>
-                    <a:blip r:embed="rId20"/>
+                    <a:blip r:embed="rId28"/>
                     <a:stretch>
                       <a:fillRect/>
                     </a:stretch>
@@ -5444,7 +6590,7 @@
         <w:drawing>
           <wp:inline xmlns:a="http://schemas.openxmlformats.org/drawingml/2006/main" xmlns:pic="http://schemas.openxmlformats.org/drawingml/2006/picture">
             <wp:extent cx="5486400" cy="3429000"/>
-            <wp:docPr id="13" name="Picture 13"/>
+            <wp:docPr id="21" name="Picture 21"/>
             <wp:cNvGraphicFramePr>
               <a:graphicFrameLocks noChangeAspect="1"/>
             </wp:cNvGraphicFramePr>
@@ -5456,7 +6602,7 @@
                     <pic:cNvPicPr/>
                   </pic:nvPicPr>
                   <pic:blipFill>
-                    <a:blip r:embed="rId21"/>
+                    <a:blip r:embed="rId29"/>
                     <a:stretch>
                       <a:fillRect/>
                     </a:stretch>
@@ -5491,6 +6637,133 @@
     </w:p>
     <w:p/>
     <w:p>
+      <w:pPr>
+        <w:pStyle w:val="Heading2"/>
+      </w:pPr>
+      <w:r>
+        <w:rPr>
+          <w:rFonts w:ascii="Microsoft YaHei" w:hAnsi="Microsoft YaHei" w:eastAsia="Microsoft YaHei"/>
+          <w:color w:val="1D4E89"/>
+        </w:rPr>
+        <w:t>8.3  按文件夹自动生成 Word 数据手册</w:t>
+      </w:r>
+    </w:p>
+    <w:p>
+      <w:r>
+        <w:rPr>
+          <w:rFonts w:ascii="Microsoft YaHei" w:hAnsi="Microsoft YaHei" w:eastAsia="Microsoft YaHei"/>
+        </w:rPr>
+        <w:t>与手动逐份勾选文档不同，这个模式只需选中一个"顶层"文件夹，DMS 会自动按文件夹结构生成章节，得到一份可以在 Word 里继续编辑排版的 .docx 文件——适合需要在提交前再做一些格式调整、或对方要求 Word 而非 PDF 的场合。</w:t>
+      </w:r>
+    </w:p>
+    <w:p>
+      <w:pPr>
+        <w:pStyle w:val="ListNumber"/>
+      </w:pPr>
+      <w:r>
+        <w:rPr>
+          <w:rFonts w:ascii="Microsoft YaHei" w:hAnsi="Microsoft YaHei" w:eastAsia="Microsoft YaHei"/>
+        </w:rPr>
+        <w:t>单击左侧边栏中的【数据手册】标签，切换到【按文件夹自动生成（Word）】。</w:t>
+      </w:r>
+    </w:p>
+    <w:p>
+      <w:pPr>
+        <w:pStyle w:val="ListNumber"/>
+      </w:pPr>
+      <w:r>
+        <w:rPr>
+          <w:rFonts w:ascii="Microsoft YaHei" w:hAnsi="Microsoft YaHei" w:eastAsia="Microsoft YaHei"/>
+        </w:rPr>
+        <w:t>勾选一个文件夹——其每个子文件夹（可多级嵌套）都会成为数据手册中的一个章节，章节内的文档按文件夹中原有顺序排列，每份文档后附上它的描述文字。</w:t>
+      </w:r>
+    </w:p>
+    <w:p>
+      <w:pPr>
+        <w:pStyle w:val="ListNumber"/>
+      </w:pPr>
+      <w:r>
+        <w:rPr>
+          <w:rFonts w:ascii="Microsoft YaHei" w:hAnsi="Microsoft YaHei" w:eastAsia="Microsoft YaHei"/>
+        </w:rPr>
+        <w:t>单击生成按钮，DMS 在服务器端生成 .docx 文件，浏览器自动下载。</w:t>
+      </w:r>
+    </w:p>
+    <w:p>
+      <w:pPr>
+        <w:jc w:val="center"/>
+      </w:pPr>
+      <w:r>
+        <w:drawing>
+          <wp:inline xmlns:a="http://schemas.openxmlformats.org/drawingml/2006/main" xmlns:pic="http://schemas.openxmlformats.org/drawingml/2006/picture">
+            <wp:extent cx="5486400" cy="2741275"/>
+            <wp:docPr id="22" name="Picture 22"/>
+            <wp:cNvGraphicFramePr>
+              <a:graphicFrameLocks noChangeAspect="1"/>
+            </wp:cNvGraphicFramePr>
+            <a:graphic>
+              <a:graphicData uri="http://schemas.openxmlformats.org/drawingml/2006/picture">
+                <pic:pic>
+                  <pic:nvPicPr>
+                    <pic:cNvPr id="0" name="34_databook_docx.png"/>
+                    <pic:cNvPicPr/>
+                  </pic:nvPicPr>
+                  <pic:blipFill>
+                    <a:blip r:embed="rId30"/>
+                    <a:stretch>
+                      <a:fillRect/>
+                    </a:stretch>
+                  </pic:blipFill>
+                  <pic:spPr>
+                    <a:xfrm>
+                      <a:off x="0" y="0"/>
+                      <a:ext cx="5486400" cy="2741275"/>
+                    </a:xfrm>
+                    <a:prstGeom prst="rect"/>
+                  </pic:spPr>
+                </pic:pic>
+              </a:graphicData>
+            </a:graphic>
+          </wp:inline>
+        </w:drawing>
+      </w:r>
+    </w:p>
+    <w:p>
+      <w:pPr>
+        <w:jc w:val="center"/>
+      </w:pPr>
+      <w:r>
+        <w:rPr>
+          <w:rFonts w:ascii="Microsoft YaHei" w:hAnsi="Microsoft YaHei" w:eastAsia="Microsoft YaHei"/>
+          <w:i/>
+          <w:color w:val="707070"/>
+          <w:sz w:val="18"/>
+        </w:rPr>
+        <w:t>图 8-3　数据手册标签的两种模式："手动选择（PDF）" 与 "按文件夹自动生成（Word）"</w:t>
+      </w:r>
+    </w:p>
+    <w:p/>
+    <w:p>
+      <w:pPr>
+        <w:ind w:left="576" w:right="576"/>
+        <w:shd w:val="clear" w:color="auto" w:fill="FFF8E1"/>
+      </w:pPr>
+      <w:r>
+        <w:rPr>
+          <w:rFonts w:ascii="Microsoft YaHei" w:hAnsi="Microsoft YaHei" w:eastAsia="Microsoft YaHei"/>
+          <w:b/>
+          <w:color w:val="924E00"/>
+        </w:rPr>
+        <w:t>注意：</w:t>
+      </w:r>
+      <w:r>
+        <w:rPr>
+          <w:rFonts w:ascii="Microsoft YaHei" w:hAnsi="Microsoft YaHei" w:eastAsia="Microsoft YaHei"/>
+        </w:rPr>
+        <w:t>两种模式生成的都是全新文件，不会修改文件夹中原有的文档；Word 模式下的表格、标题、正文都是可编辑的原生 Word 内容，而不是把 PDF 页面当图片贴进去，方便生成后再手动增删小段文字或调整格式。</w:t>
+      </w:r>
+    </w:p>
+    <w:p>
       <w:r>
         <w:br w:type="page"/>
       </w:r>
@@ -5600,7 +6873,7 @@
         <w:drawing>
           <wp:inline xmlns:a="http://schemas.openxmlformats.org/drawingml/2006/main" xmlns:pic="http://schemas.openxmlformats.org/drawingml/2006/picture">
             <wp:extent cx="5486400" cy="3429000"/>
-            <wp:docPr id="14" name="Picture 14"/>
+            <wp:docPr id="23" name="Picture 23"/>
             <wp:cNvGraphicFramePr>
               <a:graphicFrameLocks noChangeAspect="1"/>
             </wp:cNvGraphicFramePr>
@@ -5612,7 +6885,7 @@
                     <pic:cNvPicPr/>
                   </pic:nvPicPr>
                   <pic:blipFill>
-                    <a:blip r:embed="rId22"/>
+                    <a:blip r:embed="rId31"/>
                     <a:stretch>
                       <a:fillRect/>
                     </a:stretch>
@@ -5857,7 +7130,7 @@
         <w:drawing>
           <wp:inline xmlns:a="http://schemas.openxmlformats.org/drawingml/2006/main" xmlns:pic="http://schemas.openxmlformats.org/drawingml/2006/picture">
             <wp:extent cx="5486400" cy="3429000"/>
-            <wp:docPr id="15" name="Picture 15"/>
+            <wp:docPr id="24" name="Picture 24"/>
             <wp:cNvGraphicFramePr>
               <a:graphicFrameLocks noChangeAspect="1"/>
             </wp:cNvGraphicFramePr>
@@ -5869,7 +7142,7 @@
                     <pic:cNvPicPr/>
                   </pic:nvPicPr>
                   <pic:blipFill>
-                    <a:blip r:embed="rId23"/>
+                    <a:blip r:embed="rId32"/>
                     <a:stretch>
                       <a:fillRect/>
                     </a:stretch>
@@ -6020,7 +7293,7 @@
         <w:drawing>
           <wp:inline xmlns:a="http://schemas.openxmlformats.org/drawingml/2006/main" xmlns:pic="http://schemas.openxmlformats.org/drawingml/2006/picture">
             <wp:extent cx="5486400" cy="3429000"/>
-            <wp:docPr id="16" name="Picture 16"/>
+            <wp:docPr id="25" name="Picture 25"/>
             <wp:cNvGraphicFramePr>
               <a:graphicFrameLocks noChangeAspect="1"/>
             </wp:cNvGraphicFramePr>
@@ -6032,7 +7305,7 @@
                     <pic:cNvPicPr/>
                   </pic:nvPicPr>
                   <pic:blipFill>
-                    <a:blip r:embed="rId24"/>
+                    <a:blip r:embed="rId33"/>
                     <a:stretch>
                       <a:fillRect/>
                     </a:stretch>
@@ -6085,7 +7358,7 @@
         <w:drawing>
           <wp:inline xmlns:a="http://schemas.openxmlformats.org/drawingml/2006/main" xmlns:pic="http://schemas.openxmlformats.org/drawingml/2006/picture">
             <wp:extent cx="5486400" cy="3429000"/>
-            <wp:docPr id="17" name="Picture 17"/>
+            <wp:docPr id="26" name="Picture 26"/>
             <wp:cNvGraphicFramePr>
               <a:graphicFrameLocks noChangeAspect="1"/>
             </wp:cNvGraphicFramePr>
@@ -6097,7 +7370,7 @@
                     <pic:cNvPicPr/>
                   </pic:nvPicPr>
                   <pic:blipFill>
-                    <a:blip r:embed="rId25"/>
+                    <a:blip r:embed="rId34"/>
                     <a:stretch>
                       <a:fillRect/>
                     </a:stretch>
@@ -6450,7 +7723,7 @@
         <w:drawing>
           <wp:inline xmlns:a="http://schemas.openxmlformats.org/drawingml/2006/main" xmlns:pic="http://schemas.openxmlformats.org/drawingml/2006/picture">
             <wp:extent cx="5486400" cy="3429000"/>
-            <wp:docPr id="18" name="Picture 18"/>
+            <wp:docPr id="27" name="Picture 27"/>
             <wp:cNvGraphicFramePr>
               <a:graphicFrameLocks noChangeAspect="1"/>
             </wp:cNvGraphicFramePr>
@@ -6462,7 +7735,7 @@
                     <pic:cNvPicPr/>
                   </pic:nvPicPr>
                   <pic:blipFill>
-                    <a:blip r:embed="rId26"/>
+                    <a:blip r:embed="rId35"/>
                     <a:stretch>
                       <a:fillRect/>
                     </a:stretch>
@@ -7045,7 +8318,7 @@
         <w:drawing>
           <wp:inline xmlns:a="http://schemas.openxmlformats.org/drawingml/2006/main" xmlns:pic="http://schemas.openxmlformats.org/drawingml/2006/picture">
             <wp:extent cx="5486400" cy="3429000"/>
-            <wp:docPr id="19" name="Picture 19"/>
+            <wp:docPr id="28" name="Picture 28"/>
             <wp:cNvGraphicFramePr>
               <a:graphicFrameLocks noChangeAspect="1"/>
             </wp:cNvGraphicFramePr>
@@ -7057,7 +8330,7 @@
                     <pic:cNvPicPr/>
                   </pic:nvPicPr>
                   <pic:blipFill>
-                    <a:blip r:embed="rId27"/>
+                    <a:blip r:embed="rId36"/>
                     <a:stretch>
                       <a:fillRect/>
                     </a:stretch>
@@ -7110,7 +8383,7 @@
         <w:drawing>
           <wp:inline xmlns:a="http://schemas.openxmlformats.org/drawingml/2006/main" xmlns:pic="http://schemas.openxmlformats.org/drawingml/2006/picture">
             <wp:extent cx="5486400" cy="3429000"/>
-            <wp:docPr id="20" name="Picture 20"/>
+            <wp:docPr id="29" name="Picture 29"/>
             <wp:cNvGraphicFramePr>
               <a:graphicFrameLocks noChangeAspect="1"/>
             </wp:cNvGraphicFramePr>
@@ -7122,7 +8395,7 @@
                     <pic:cNvPicPr/>
                   </pic:nvPicPr>
                   <pic:blipFill>
-                    <a:blip r:embed="rId28"/>
+                    <a:blip r:embed="rId37"/>
                     <a:stretch>
                       <a:fillRect/>
                     </a:stretch>
@@ -7175,7 +8448,7 @@
         <w:drawing>
           <wp:inline xmlns:a="http://schemas.openxmlformats.org/drawingml/2006/main" xmlns:pic="http://schemas.openxmlformats.org/drawingml/2006/picture">
             <wp:extent cx="5486400" cy="3429000"/>
-            <wp:docPr id="21" name="Picture 21"/>
+            <wp:docPr id="30" name="Picture 30"/>
             <wp:cNvGraphicFramePr>
               <a:graphicFrameLocks noChangeAspect="1"/>
             </wp:cNvGraphicFramePr>
@@ -7187,7 +8460,7 @@
                     <pic:cNvPicPr/>
                   </pic:nvPicPr>
                   <pic:blipFill>
-                    <a:blip r:embed="rId29"/>
+                    <a:blip r:embed="rId38"/>
                     <a:stretch>
                       <a:fillRect/>
                     </a:stretch>
@@ -7524,7 +8797,7 @@
         <w:drawing>
           <wp:inline xmlns:a="http://schemas.openxmlformats.org/drawingml/2006/main" xmlns:pic="http://schemas.openxmlformats.org/drawingml/2006/picture">
             <wp:extent cx="5486400" cy="3429000"/>
-            <wp:docPr id="22" name="Picture 22"/>
+            <wp:docPr id="31" name="Picture 31"/>
             <wp:cNvGraphicFramePr>
               <a:graphicFrameLocks noChangeAspect="1"/>
             </wp:cNvGraphicFramePr>
@@ -7536,7 +8809,7 @@
                     <pic:cNvPicPr/>
                   </pic:nvPicPr>
                   <pic:blipFill>
-                    <a:blip r:embed="rId30"/>
+                    <a:blip r:embed="rId39"/>
                     <a:stretch>
                       <a:fillRect/>
                     </a:stretch>
@@ -7664,7 +8937,7 @@
         <w:drawing>
           <wp:inline xmlns:a="http://schemas.openxmlformats.org/drawingml/2006/main" xmlns:pic="http://schemas.openxmlformats.org/drawingml/2006/picture">
             <wp:extent cx="5486400" cy="3429000"/>
-            <wp:docPr id="23" name="Picture 23"/>
+            <wp:docPr id="32" name="Picture 32"/>
             <wp:cNvGraphicFramePr>
               <a:graphicFrameLocks noChangeAspect="1"/>
             </wp:cNvGraphicFramePr>
@@ -7676,7 +8949,7 @@
                     <pic:cNvPicPr/>
                   </pic:nvPicPr>
                   <pic:blipFill>
-                    <a:blip r:embed="rId31"/>
+                    <a:blip r:embed="rId40"/>
                     <a:stretch>
                       <a:fillRect/>
                     </a:stretch>
@@ -8097,7 +9370,620 @@
           <w:rFonts w:ascii="Microsoft YaHei" w:hAnsi="Microsoft YaHei" w:eastAsia="Microsoft YaHei"/>
           <w:color w:val="1E40AF"/>
         </w:rPr>
-        <w:t>16  常见问题与解决方法</w:t>
+        <w:t>16  同时打开多个项目</w:t>
+      </w:r>
+    </w:p>
+    <w:p>
+      <w:r>
+        <w:rPr>
+          <w:rFonts w:ascii="Microsoft YaHei" w:hAnsi="Microsoft YaHei" w:eastAsia="Microsoft YaHei"/>
+        </w:rPr>
+        <w:t>DMS 不再局限于同一时间只能使用一个项目。</w:t>
+      </w:r>
+    </w:p>
+    <w:p>
+      <w:pPr>
+        <w:pStyle w:val="ListNumber"/>
+      </w:pPr>
+      <w:r>
+        <w:rPr>
+          <w:rFonts w:ascii="Microsoft YaHei" w:hAnsi="Microsoft YaHei" w:eastAsia="Microsoft YaHei"/>
+        </w:rPr>
+        <w:t>单击顶部标题栏中的【项目】菜单，选择"打开另一个项目"一类的入口（或直接再次运行 DMS.app / DMS.exe 并在第 1.3 节的启动窗口中选择另一个项目文件夹）。</w:t>
+      </w:r>
+    </w:p>
+    <w:p>
+      <w:pPr>
+        <w:pStyle w:val="ListNumber"/>
+      </w:pPr>
+      <w:r>
+        <w:rPr>
+          <w:rFonts w:ascii="Microsoft YaHei" w:hAnsi="Microsoft YaHei" w:eastAsia="Microsoft YaHei"/>
+        </w:rPr>
+        <w:t>DMS 会为这个新项目单独启动一个窗口和一套独立的服务，使用不同的本机端口，与原窗口互不干扰——两个窗口可以同时登录、同时操作，互不顶掉对方的登录状态。</w:t>
+      </w:r>
+    </w:p>
+    <w:p>
+      <w:pPr>
+        <w:pStyle w:val="ListNumber"/>
+      </w:pPr>
+      <w:r>
+        <w:rPr>
+          <w:rFonts w:ascii="Microsoft YaHei" w:hAnsi="Microsoft YaHei" w:eastAsia="Microsoft YaHei"/>
+        </w:rPr>
+        <w:t>如果对同一个项目文件夹重复发起"打开"，DMS 会识别出已有窗口在服务这个项目，直接切换到那个窗口，而不会重复启动一份服务。</w:t>
+      </w:r>
+    </w:p>
+    <w:p>
+      <w:pPr>
+        <w:ind w:left="576" w:right="576"/>
+        <w:shd w:val="clear" w:color="auto" w:fill="FFF8E1"/>
+      </w:pPr>
+      <w:r>
+        <w:rPr>
+          <w:rFonts w:ascii="Microsoft YaHei" w:hAnsi="Microsoft YaHei" w:eastAsia="Microsoft YaHei"/>
+          <w:b/>
+          <w:color w:val="924E00"/>
+        </w:rPr>
+        <w:t>注意：</w:t>
+      </w:r>
+      <w:r>
+        <w:rPr>
+          <w:rFonts w:ascii="Microsoft YaHei" w:hAnsi="Microsoft YaHei" w:eastAsia="Microsoft YaHei"/>
+        </w:rPr>
+        <w:t>每次正常退出 DMS（红色关闭按钮、【退出 DMS】按钮、Cmd+Q、Dock 右键退出等标准方式）时，DMS 都会记住当前项目的路径，下次直接双击启动时，第 1.3 节启动窗口里的【继续上次的项目】就会指向这一个——如果同时开着多个项目窗口，"上次"记录的是最后一个正常退出的那个。</w:t>
+      </w:r>
+    </w:p>
+    <w:p>
+      <w:r>
+        <w:br w:type="page"/>
+      </w:r>
+    </w:p>
+    <w:p>
+      <w:pPr>
+        <w:pStyle w:val="Heading1"/>
+      </w:pPr>
+      <w:r>
+        <w:rPr>
+          <w:rFonts w:ascii="Microsoft YaHei" w:hAnsi="Microsoft YaHei" w:eastAsia="Microsoft YaHei"/>
+          <w:color w:val="1E40AF"/>
+        </w:rPr>
+        <w:t>17  合并项目</w:t>
+      </w:r>
+    </w:p>
+    <w:p>
+      <w:r>
+        <w:rPr>
+          <w:rFonts w:ascii="Microsoft YaHei" w:hAnsi="Microsoft YaHei" w:eastAsia="Microsoft YaHei"/>
+        </w:rPr>
+        <w:t>如果同一份资料曾经在两台电脑上分别整理（或两个人各自建了一份项目），现在想拼成一份，不需要手动搬文件——"合并项目"会自动把另一个独立项目的文件夹树和文档整体并入当前正在使用的项目。</w:t>
+      </w:r>
+    </w:p>
+    <w:p>
+      <w:pPr>
+        <w:pStyle w:val="ListNumber"/>
+      </w:pPr>
+      <w:r>
+        <w:rPr>
+          <w:rFonts w:ascii="Microsoft YaHei" w:hAnsi="Microsoft YaHei" w:eastAsia="Microsoft YaHei"/>
+        </w:rPr>
+        <w:t>单击顶部标题栏中的【项目】菜单。</w:t>
+      </w:r>
+    </w:p>
+    <w:p>
+      <w:pPr>
+        <w:pStyle w:val="ListNumber"/>
+      </w:pPr>
+      <w:r>
+        <w:rPr>
+          <w:rFonts w:ascii="Microsoft YaHei" w:hAnsi="Microsoft YaHei" w:eastAsia="Microsoft YaHei"/>
+        </w:rPr>
+        <w:t>在【导入 IMPORT】区域选择【合并其他子项目…】。</w:t>
+      </w:r>
+    </w:p>
+    <w:p>
+      <w:pPr>
+        <w:pStyle w:val="ListNumber"/>
+      </w:pPr>
+      <w:r>
+        <w:rPr>
+          <w:rFonts w:ascii="Microsoft YaHei" w:hAnsi="Microsoft YaHei" w:eastAsia="Microsoft YaHei"/>
+        </w:rPr>
+        <w:t>在弹出的对话框中单击【添加子项目文件夹…】，选择另一个独立 DMS 项目的存储文件夹（可一次添加多个）。</w:t>
+      </w:r>
+    </w:p>
+    <w:p>
+      <w:pPr>
+        <w:pStyle w:val="ListNumber"/>
+      </w:pPr>
+      <w:r>
+        <w:rPr>
+          <w:rFonts w:ascii="Microsoft YaHei" w:hAnsi="Microsoft YaHei" w:eastAsia="Microsoft YaHei"/>
+        </w:rPr>
+        <w:t>单击【预览（不做任何更改）】可以先看一遍将会发生的合并结果，确认无误后再单击【合并】正式执行；也可以跳过预览直接单击【合并】。</w:t>
+      </w:r>
+    </w:p>
+    <w:p>
+      <w:pPr>
+        <w:jc w:val="center"/>
+      </w:pPr>
+      <w:r>
+        <w:drawing>
+          <wp:inline xmlns:a="http://schemas.openxmlformats.org/drawingml/2006/main" xmlns:pic="http://schemas.openxmlformats.org/drawingml/2006/picture">
+            <wp:extent cx="5486400" cy="2741275"/>
+            <wp:docPr id="33" name="Picture 33"/>
+            <wp:cNvGraphicFramePr>
+              <a:graphicFrameLocks noChangeAspect="1"/>
+            </wp:cNvGraphicFramePr>
+            <a:graphic>
+              <a:graphicData uri="http://schemas.openxmlformats.org/drawingml/2006/picture">
+                <pic:pic>
+                  <pic:nvPicPr>
+                    <pic:cNvPr id="0" name="31_combine_project.png"/>
+                    <pic:cNvPicPr/>
+                  </pic:nvPicPr>
+                  <pic:blipFill>
+                    <a:blip r:embed="rId41"/>
+                    <a:stretch>
+                      <a:fillRect/>
+                    </a:stretch>
+                  </pic:blipFill>
+                  <pic:spPr>
+                    <a:xfrm>
+                      <a:off x="0" y="0"/>
+                      <a:ext cx="5486400" cy="2741275"/>
+                    </a:xfrm>
+                    <a:prstGeom prst="rect"/>
+                  </pic:spPr>
+                </pic:pic>
+              </a:graphicData>
+            </a:graphic>
+          </wp:inline>
+        </w:drawing>
+      </w:r>
+    </w:p>
+    <w:p>
+      <w:pPr>
+        <w:jc w:val="center"/>
+      </w:pPr>
+      <w:r>
+        <w:rPr>
+          <w:rFonts w:ascii="Microsoft YaHei" w:hAnsi="Microsoft YaHei" w:eastAsia="Microsoft YaHei"/>
+          <w:i/>
+          <w:color w:val="707070"/>
+          <w:sz w:val="18"/>
+        </w:rPr>
+        <w:t>图 17-1　合并其他子项目对话框</w:t>
+      </w:r>
+    </w:p>
+    <w:p/>
+    <w:p>
+      <w:r>
+        <w:rPr>
+          <w:rFonts w:ascii="Microsoft YaHei" w:hAnsi="Microsoft YaHei" w:eastAsia="Microsoft YaHei"/>
+        </w:rPr>
+        <w:t>合并规则：</w:t>
+      </w:r>
+    </w:p>
+    <w:p>
+      <w:pPr>
+        <w:pStyle w:val="ListBullet"/>
+        <w:ind w:left="360"/>
+      </w:pPr>
+      <w:r>
+        <w:rPr>
+          <w:rFonts w:ascii="Microsoft YaHei" w:hAnsi="Microsoft YaHei" w:eastAsia="Microsoft YaHei"/>
+        </w:rPr>
+        <w:t>名称相同的文件夹会自动合并到当前项目里对应的文件夹中（不会产生两个同名的并列文件夹）。</w:t>
+      </w:r>
+    </w:p>
+    <w:p>
+      <w:pPr>
+        <w:pStyle w:val="ListBullet"/>
+        <w:ind w:left="360"/>
+      </w:pPr>
+      <w:r>
+        <w:rPr>
+          <w:rFonts w:ascii="Microsoft YaHei" w:hAnsi="Microsoft YaHei" w:eastAsia="Microsoft YaHei"/>
+        </w:rPr>
+        <w:t>完全相同的文档（内容一致）会被自动识别为重复并跳过，不会重复导入占用双倍空间。</w:t>
+      </w:r>
+    </w:p>
+    <w:p>
+      <w:pPr>
+        <w:pStyle w:val="ListBullet"/>
+        <w:ind w:left="360"/>
+      </w:pPr>
+      <w:r>
+        <w:rPr>
+          <w:rFonts w:ascii="Microsoft YaHei" w:hAnsi="Microsoft YaHei" w:eastAsia="Microsoft YaHei"/>
+        </w:rPr>
+        <w:t>原项目文件夹中的文件和文件夹永远不会被修改或删除——合并是"复制式"的单向操作，原项目可以继续保留、继续独立使用。</w:t>
+      </w:r>
+    </w:p>
+    <w:p>
+      <w:pPr>
+        <w:ind w:left="576" w:right="576"/>
+        <w:shd w:val="clear" w:color="auto" w:fill="E6F4EA"/>
+      </w:pPr>
+      <w:r>
+        <w:rPr>
+          <w:rFonts w:ascii="Microsoft YaHei" w:hAnsi="Microsoft YaHei" w:eastAsia="Microsoft YaHei"/>
+          <w:b/>
+          <w:color w:val="056F00"/>
+        </w:rPr>
+        <w:t>提示：</w:t>
+      </w:r>
+      <w:r>
+        <w:rPr>
+          <w:rFonts w:ascii="Microsoft YaHei" w:hAnsi="Microsoft YaHei" w:eastAsia="Microsoft YaHei"/>
+          <w:color w:val="333333"/>
+        </w:rPr>
+        <w:t>适合场景：两台电脑（或两个人）各自整理了一段时间的同一批资料，现在要拼成一份完整的；也适合把一份"验收拍照专用"的小项目并回主项目。</w:t>
+      </w:r>
+    </w:p>
+    <w:p>
+      <w:r>
+        <w:br w:type="page"/>
+      </w:r>
+    </w:p>
+    <w:p>
+      <w:pPr>
+        <w:pStyle w:val="Heading1"/>
+      </w:pPr>
+      <w:r>
+        <w:rPr>
+          <w:rFonts w:ascii="Microsoft YaHei" w:hAnsi="Microsoft YaHei" w:eastAsia="Microsoft YaHei"/>
+          <w:color w:val="1E40AF"/>
+        </w:rPr>
+        <w:t>18  文件夹级"问 AI"：批量文档问答与生成 PDF</w:t>
+      </w:r>
+    </w:p>
+    <w:p>
+      <w:r>
+        <w:rPr>
+          <w:rFonts w:ascii="Microsoft YaHei" w:hAnsi="Microsoft YaHei" w:eastAsia="Microsoft YaHei"/>
+        </w:rPr>
+        <w:t>第 4.9 节介绍的是针对单份文档提问；如果想让 AI 一次性读取一个文件夹里的多份文档来回答问题（例如"这几张收据加起来一共多少钱"），可以使用文件夹工具栏上的【问 AI】。</w:t>
+      </w:r>
+    </w:p>
+    <w:p>
+      <w:pPr>
+        <w:pStyle w:val="ListNumber"/>
+      </w:pPr>
+      <w:r>
+        <w:rPr>
+          <w:rFonts w:ascii="Microsoft YaHei" w:hAnsi="Microsoft YaHei" w:eastAsia="Microsoft YaHei"/>
+        </w:rPr>
+        <w:t>选中目标文件夹，单击工具栏的【问 AI】。</w:t>
+      </w:r>
+    </w:p>
+    <w:p>
+      <w:pPr>
+        <w:pStyle w:val="ListNumber"/>
+      </w:pPr>
+      <w:r>
+        <w:rPr>
+          <w:rFonts w:ascii="Microsoft YaHei" w:hAnsi="Microsoft YaHei" w:eastAsia="Microsoft YaHei"/>
+        </w:rPr>
+        <w:t>弹出的对话框左侧列出该文件夹（含子文件夹）中的全部文档，逐一勾选要提供给 AI 的文档；右上角可在"列表 / 小图标 / 大图标 / 超大图标"之间切换查看方式，方便先看清楚是哪些文档再勾选——这个显示尺寸的选择会被记住，下次打开还是同样的尺寸。</w:t>
+      </w:r>
+    </w:p>
+    <w:p>
+      <w:pPr>
+        <w:pStyle w:val="ListNumber"/>
+      </w:pPr>
+      <w:r>
+        <w:rPr>
+          <w:rFonts w:ascii="Microsoft YaHei" w:hAnsi="Microsoft YaHei" w:eastAsia="Microsoft YaHei"/>
+        </w:rPr>
+        <w:t>在下方文本框输入您的请求或问题（或单击麦克风语音输入），然后二选一：</w:t>
+      </w:r>
+    </w:p>
+    <w:p>
+      <w:pPr>
+        <w:pStyle w:val="ListBullet"/>
+        <w:ind w:left="360"/>
+      </w:pPr>
+      <w:r>
+        <w:rPr>
+          <w:rFonts w:ascii="Microsoft YaHei" w:hAnsi="Microsoft YaHei" w:eastAsia="Microsoft YaHei"/>
+        </w:rPr>
+        <w:t>【直接问 AI】——AI（Gemini 或 DeepSeek）读取选中文档的内容来回答，并注明依据了哪些文档；勾选【让 AI 查看照片/扫描件】后，连没有文字层的照片、扫描件也能被直接"看懂"（仅 Gemini 支持，速度较慢）。此按钮需要先配置 API Key（见第 6.4 节）。</w:t>
+      </w:r>
+    </w:p>
+    <w:p>
+      <w:pPr>
+        <w:pStyle w:val="ListBullet"/>
+        <w:ind w:left="360"/>
+      </w:pPr>
+      <w:r>
+        <w:rPr>
+          <w:rFonts w:ascii="Microsoft YaHei" w:hAnsi="Microsoft YaHei" w:eastAsia="Microsoft YaHei"/>
+        </w:rPr>
+        <w:t>【生成 PDF（供 ChatGPT 等）】——把选中的文档（照片带上拍摄日期/定位/备注，PDF 原样合并）整理成一份完整的 PDF，方便复制或发给 ChatGPT、Claude 等外部 AI 工具继续追问；此按钮不需要配置 API Key。</w:t>
+      </w:r>
+    </w:p>
+    <w:p>
+      <w:pPr>
+        <w:jc w:val="center"/>
+      </w:pPr>
+      <w:r>
+        <w:drawing>
+          <wp:inline xmlns:a="http://schemas.openxmlformats.org/drawingml/2006/main" xmlns:pic="http://schemas.openxmlformats.org/drawingml/2006/picture">
+            <wp:extent cx="5486400" cy="2737425"/>
+            <wp:docPr id="34" name="Picture 34"/>
+            <wp:cNvGraphicFramePr>
+              <a:graphicFrameLocks noChangeAspect="1"/>
+            </wp:cNvGraphicFramePr>
+            <a:graphic>
+              <a:graphicData uri="http://schemas.openxmlformats.org/drawingml/2006/picture">
+                <pic:pic>
+                  <pic:nvPicPr>
+                    <pic:cNvPr id="0" name="26_folder_ask_ai.png"/>
+                    <pic:cNvPicPr/>
+                  </pic:nvPicPr>
+                  <pic:blipFill>
+                    <a:blip r:embed="rId42"/>
+                    <a:stretch>
+                      <a:fillRect/>
+                    </a:stretch>
+                  </pic:blipFill>
+                  <pic:spPr>
+                    <a:xfrm>
+                      <a:off x="0" y="0"/>
+                      <a:ext cx="5486400" cy="2737425"/>
+                    </a:xfrm>
+                    <a:prstGeom prst="rect"/>
+                  </pic:spPr>
+                </pic:pic>
+              </a:graphicData>
+            </a:graphic>
+          </wp:inline>
+        </w:drawing>
+      </w:r>
+    </w:p>
+    <w:p>
+      <w:pPr>
+        <w:jc w:val="center"/>
+      </w:pPr>
+      <w:r>
+        <w:rPr>
+          <w:rFonts w:ascii="Microsoft YaHei" w:hAnsi="Microsoft YaHei" w:eastAsia="Microsoft YaHei"/>
+          <w:i/>
+          <w:color w:val="707070"/>
+          <w:sz w:val="18"/>
+        </w:rPr>
+        <w:t>图 18-1　对文件夹提问 AI：勾选文档、选择问答方式</w:t>
+      </w:r>
+    </w:p>
+    <w:p/>
+    <w:p>
+      <w:pPr>
+        <w:pStyle w:val="ListNumber"/>
+      </w:pPr>
+      <w:r>
+        <w:rPr>
+          <w:rFonts w:ascii="Microsoft YaHei" w:hAnsi="Microsoft YaHei" w:eastAsia="Microsoft YaHei"/>
+        </w:rPr>
+        <w:t>勾选【存档答案到文件夹内的 Q&amp;A 记录】后，问答记录会追加保存进这个文件夹的一份"AI 问答记录.pdf"中，越攒越全，方便以后回看，不用重新问一遍。</w:t>
+      </w:r>
+    </w:p>
+    <w:p>
+      <w:pPr>
+        <w:ind w:left="576" w:right="576"/>
+        <w:shd w:val="clear" w:color="auto" w:fill="E6F4EA"/>
+      </w:pPr>
+      <w:r>
+        <w:rPr>
+          <w:rFonts w:ascii="Microsoft YaHei" w:hAnsi="Microsoft YaHei" w:eastAsia="Microsoft YaHei"/>
+          <w:b/>
+          <w:color w:val="056F00"/>
+        </w:rPr>
+        <w:t>提示：</w:t>
+      </w:r>
+      <w:r>
+        <w:rPr>
+          <w:rFonts w:ascii="Microsoft YaHei" w:hAnsi="Microsoft YaHei" w:eastAsia="Microsoft YaHei"/>
+          <w:color w:val="333333"/>
+        </w:rPr>
+        <w:t>示例：给"报税资料"文件夹里的收据、银行流水、上一年报税单都勾上，直接问"今年大概能退多少税"；或者整理成一份 PDF，拿去问其他 AI 工具做交叉核对。</w:t>
+      </w:r>
+    </w:p>
+    <w:p>
+      <w:r>
+        <w:br w:type="page"/>
+      </w:r>
+    </w:p>
+    <w:p>
+      <w:pPr>
+        <w:pStyle w:val="Heading1"/>
+      </w:pPr>
+      <w:r>
+        <w:rPr>
+          <w:rFonts w:ascii="Microsoft YaHei" w:hAnsi="Microsoft YaHei" w:eastAsia="Microsoft YaHei"/>
+          <w:color w:val="1E40AF"/>
+        </w:rPr>
+        <w:t>19  图标视图：弹出窗口与批量操作</w:t>
+      </w:r>
+    </w:p>
+    <w:p>
+      <w:r>
+        <w:rPr>
+          <w:rFonts w:ascii="Microsoft YaHei" w:hAnsi="Microsoft YaHei" w:eastAsia="Microsoft YaHei"/>
+        </w:rPr>
+        <w:t>文件夹的文档列表除了默认的列表视图，还可以切换成"图标视图"（类似 Windows 资源管理器的缩略图浏览），并且可以独立弹出成一个单独的窗口。</w:t>
+      </w:r>
+    </w:p>
+    <w:p>
+      <w:pPr>
+        <w:pStyle w:val="ListNumber"/>
+      </w:pPr>
+      <w:r>
+        <w:rPr>
+          <w:rFonts w:ascii="Microsoft YaHei" w:hAnsi="Microsoft YaHei" w:eastAsia="Microsoft YaHei"/>
+        </w:rPr>
+        <w:t>在文件夹的文档区域，单击列表/图标切换按钮中的图标视图（网格状图标）。</w:t>
+      </w:r>
+    </w:p>
+    <w:p>
+      <w:pPr>
+        <w:pStyle w:val="ListNumber"/>
+      </w:pPr>
+      <w:r>
+        <w:rPr>
+          <w:rFonts w:ascii="Microsoft YaHei" w:hAnsi="Microsoft YaHei" w:eastAsia="Microsoft YaHei"/>
+        </w:rPr>
+        <w:t>在"小图标 / 大图标"（超大图标仅弹出窗口提供）之间切换缩略图大小。</w:t>
+      </w:r>
+    </w:p>
+    <w:p>
+      <w:pPr>
+        <w:pStyle w:val="ListNumber"/>
+      </w:pPr>
+      <w:r>
+        <w:rPr>
+          <w:rFonts w:ascii="Microsoft YaHei" w:hAnsi="Microsoft YaHei" w:eastAsia="Microsoft YaHei"/>
+        </w:rPr>
+        <w:t>单击【弹出】，图标视图会在一个独立的浏览器窗口中打开——可以把它拖到另一个显示器上单独摆着，随意调整大小，不占用主窗口的空间。</w:t>
+      </w:r>
+    </w:p>
+    <w:p>
+      <w:pPr>
+        <w:jc w:val="center"/>
+      </w:pPr>
+      <w:r>
+        <w:drawing>
+          <wp:inline xmlns:a="http://schemas.openxmlformats.org/drawingml/2006/main" xmlns:pic="http://schemas.openxmlformats.org/drawingml/2006/picture">
+            <wp:extent cx="5486400" cy="2578748"/>
+            <wp:docPr id="35" name="Picture 35"/>
+            <wp:cNvGraphicFramePr>
+              <a:graphicFrameLocks noChangeAspect="1"/>
+            </wp:cNvGraphicFramePr>
+            <a:graphic>
+              <a:graphicData uri="http://schemas.openxmlformats.org/drawingml/2006/picture">
+                <pic:pic>
+                  <pic:nvPicPr>
+                    <pic:cNvPr id="0" name="37_popout_grid.png"/>
+                    <pic:cNvPicPr/>
+                  </pic:nvPicPr>
+                  <pic:blipFill>
+                    <a:blip r:embed="rId43"/>
+                    <a:stretch>
+                      <a:fillRect/>
+                    </a:stretch>
+                  </pic:blipFill>
+                  <pic:spPr>
+                    <a:xfrm>
+                      <a:off x="0" y="0"/>
+                      <a:ext cx="5486400" cy="2578748"/>
+                    </a:xfrm>
+                    <a:prstGeom prst="rect"/>
+                  </pic:spPr>
+                </pic:pic>
+              </a:graphicData>
+            </a:graphic>
+          </wp:inline>
+        </w:drawing>
+      </w:r>
+    </w:p>
+    <w:p>
+      <w:pPr>
+        <w:jc w:val="center"/>
+      </w:pPr>
+      <w:r>
+        <w:rPr>
+          <w:rFonts w:ascii="Microsoft YaHei" w:hAnsi="Microsoft YaHei" w:eastAsia="Microsoft YaHei"/>
+          <w:i/>
+          <w:color w:val="707070"/>
+          <w:sz w:val="18"/>
+        </w:rPr>
+        <w:t>图 19-1　弹出的图标视图窗口：多选模式下可批量下载、删除或加前缀</w:t>
+      </w:r>
+    </w:p>
+    <w:p/>
+    <w:p>
+      <w:pPr>
+        <w:pStyle w:val="ListNumber"/>
+      </w:pPr>
+      <w:r>
+        <w:rPr>
+          <w:rFonts w:ascii="Microsoft YaHei" w:hAnsi="Microsoft YaHei" w:eastAsia="Microsoft YaHei"/>
+        </w:rPr>
+        <w:t>弹出窗口右上角单击【多选】进入多选模式，勾选若干文件后可以：</w:t>
+      </w:r>
+    </w:p>
+    <w:p>
+      <w:pPr>
+        <w:pStyle w:val="ListBullet"/>
+        <w:ind w:left="360"/>
+      </w:pPr>
+      <w:r>
+        <w:rPr>
+          <w:rFonts w:ascii="Microsoft YaHei" w:hAnsi="Microsoft YaHei" w:eastAsia="Microsoft YaHei"/>
+        </w:rPr>
+        <w:t>【下载】——把选中的文件依次下载到本地。</w:t>
+      </w:r>
+    </w:p>
+    <w:p>
+      <w:pPr>
+        <w:pStyle w:val="ListBullet"/>
+        <w:ind w:left="360"/>
+      </w:pPr>
+      <w:r>
+        <w:rPr>
+          <w:rFonts w:ascii="Microsoft YaHei" w:hAnsi="Microsoft YaHei" w:eastAsia="Microsoft YaHei"/>
+        </w:rPr>
+        <w:t>【加前缀】——给一批文件名统一加上一段前缀（例如在日期后面补一句说明），一次性批量重命名。</w:t>
+      </w:r>
+    </w:p>
+    <w:p>
+      <w:pPr>
+        <w:pStyle w:val="ListBullet"/>
+        <w:ind w:left="360"/>
+      </w:pPr>
+      <w:r>
+        <w:rPr>
+          <w:rFonts w:ascii="Microsoft YaHei" w:hAnsi="Microsoft YaHei" w:eastAsia="Microsoft YaHei"/>
+        </w:rPr>
+        <w:t>【删除】——批量软删除选中的文件（移入"Not Show in Tree"，见第 3.2 节）。</w:t>
+      </w:r>
+    </w:p>
+    <w:p>
+      <w:pPr>
+        <w:ind w:left="576" w:right="576"/>
+        <w:shd w:val="clear" w:color="auto" w:fill="FFF8E1"/>
+      </w:pPr>
+      <w:r>
+        <w:rPr>
+          <w:rFonts w:ascii="Microsoft YaHei" w:hAnsi="Microsoft YaHei" w:eastAsia="Microsoft YaHei"/>
+          <w:b/>
+          <w:color w:val="924E00"/>
+        </w:rPr>
+        <w:t>注意：</w:t>
+      </w:r>
+      <w:r>
+        <w:rPr>
+          <w:rFonts w:ascii="Microsoft YaHei" w:hAnsi="Microsoft YaHei" w:eastAsia="Microsoft YaHei"/>
+        </w:rPr>
+        <w:t>弹出窗口通过浏览器的标签页间通信实现，如果长时间未与主窗口交互，重新打开主窗口的对应文件夹后，弹出窗口可能提示"已过期"——按提示重新点击【弹出】打开一个新的即可，不影响文档本身。</w:t>
+      </w:r>
+    </w:p>
+    <w:p>
+      <w:r>
+        <w:br w:type="page"/>
+      </w:r>
+    </w:p>
+    <w:p>
+      <w:pPr>
+        <w:pStyle w:val="Heading1"/>
+      </w:pPr>
+      <w:r>
+        <w:rPr>
+          <w:rFonts w:ascii="Microsoft YaHei" w:hAnsi="Microsoft YaHei" w:eastAsia="Microsoft YaHei"/>
+          <w:color w:val="1E40AF"/>
+        </w:rPr>
+        <w:t>20  常见问题与解决方法</w:t>
       </w:r>
     </w:p>
     <w:tbl>
@@ -8154,7 +10040,7 @@
               <w:rPr>
                 <w:rFonts w:ascii="Microsoft YaHei" w:hAnsi="Microsoft YaHei" w:eastAsia="Microsoft YaHei"/>
               </w:rPr>
-              <w:t>Windows SmartScreen 阻止 DMS.exe 运行</w:t>
+              <w:t>Windows SmartScreen 阻止 DMS.exe 运行，或双击后长时间无反应</w:t>
             </w:r>
           </w:p>
         </w:tc>
@@ -8167,7 +10053,7 @@
               <w:rPr>
                 <w:rFonts w:ascii="Microsoft YaHei" w:hAnsi="Microsoft YaHei" w:eastAsia="Microsoft YaHei"/>
               </w:rPr>
-              <w:t>单击【更多信息】，然后单击【仍要运行】。此提示是因为文件未经商业签名，程序本身是安全的。</w:t>
+              <w:t>单击【更多信息】然后【仍要运行】；如果毫无反应，多半是文件被标记为"来自其他计算机"，请按第 1.4 节解除阻止。</w:t>
             </w:r>
           </w:p>
         </w:tc>
@@ -8588,6 +10474,90 @@
                 <w:rFonts w:ascii="Microsoft YaHei" w:hAnsi="Microsoft YaHei" w:eastAsia="Microsoft YaHei"/>
               </w:rPr>
               <w:t>请确认录音中确实包含清晰的人声（纯音乐、静音或环境噪音会被判定为"未检测到语音内容"）；若提示"UNAVAILABLE"或"高需求"，通常是 Gemini 服务临时繁忙，稍后重试即可。</w:t>
+            </w:r>
+          </w:p>
+        </w:tc>
+      </w:tr>
+      <w:tr>
+        <w:tc>
+          <w:tcPr>
+            <w:tcW w:type="dxa" w:w="3600"/>
+          </w:tcPr>
+          <w:p>
+            <w:r>
+              <w:rPr>
+                <w:rFonts w:ascii="Microsoft YaHei" w:hAnsi="Microsoft YaHei" w:eastAsia="Microsoft YaHei"/>
+              </w:rPr>
+              <w:t>启动窗口里"继续上次的项目"按钮是灰色的</w:t>
+            </w:r>
+          </w:p>
+        </w:tc>
+        <w:tc>
+          <w:tcPr>
+            <w:tcW w:type="dxa" w:w="5760"/>
+          </w:tcPr>
+          <w:p>
+            <w:r>
+              <w:rPr>
+                <w:rFonts w:ascii="Microsoft YaHei" w:hAnsi="Microsoft YaHei" w:eastAsia="Microsoft YaHei"/>
+              </w:rPr>
+              <w:t>说明还没有任何一次正常退出记录（首次使用，或上次是被强制结束进程），此时请改用【选择项目…】或【新建项目…】，见第 1.3 节。</w:t>
+            </w:r>
+          </w:p>
+        </w:tc>
+      </w:tr>
+      <w:tr>
+        <w:tc>
+          <w:tcPr>
+            <w:tcW w:type="dxa" w:w="3600"/>
+          </w:tcPr>
+          <w:p>
+            <w:r>
+              <w:rPr>
+                <w:rFonts w:ascii="Microsoft YaHei" w:hAnsi="Microsoft YaHei" w:eastAsia="Microsoft YaHei"/>
+              </w:rPr>
+              <w:t>弹出的图标视图窗口显示"该窗口已过期"</w:t>
+            </w:r>
+          </w:p>
+        </w:tc>
+        <w:tc>
+          <w:tcPr>
+            <w:tcW w:type="dxa" w:w="5760"/>
+          </w:tcPr>
+          <w:p>
+            <w:r>
+              <w:rPr>
+                <w:rFonts w:ascii="Microsoft YaHei" w:hAnsi="Microsoft YaHei" w:eastAsia="Microsoft YaHei"/>
+              </w:rPr>
+              <w:t>回到主窗口重新点击一次【弹出】即可打开一个新的；这是弹出窗口与主窗口之间一次性握手令牌的正常过期机制，不影响任何文档。</w:t>
+            </w:r>
+          </w:p>
+        </w:tc>
+      </w:tr>
+      <w:tr>
+        <w:tc>
+          <w:tcPr>
+            <w:tcW w:type="dxa" w:w="3600"/>
+          </w:tcPr>
+          <w:p>
+            <w:r>
+              <w:rPr>
+                <w:rFonts w:ascii="Microsoft YaHei" w:hAnsi="Microsoft YaHei" w:eastAsia="Microsoft YaHei"/>
+              </w:rPr>
+              <w:t>合并项目后，某个文件夹里的文档数量比预期少</w:t>
+            </w:r>
+          </w:p>
+        </w:tc>
+        <w:tc>
+          <w:tcPr>
+            <w:tcW w:type="dxa" w:w="5760"/>
+          </w:tcPr>
+          <w:p>
+            <w:r>
+              <w:rPr>
+                <w:rFonts w:ascii="Microsoft YaHei" w:hAnsi="Microsoft YaHei" w:eastAsia="Microsoft YaHei"/>
+              </w:rPr>
+              <w:t>完全相同的文档会被自动判定为重复并跳过，不会重复导入，属于正常设计；如需保留两份，请在原项目中先把该文档重命名或稍作修改后再合并，见第 17 章。</w:t>
             </w:r>
           </w:p>
         </w:tc>
@@ -9352,6 +11322,286 @@
                 <w:rFonts w:ascii="Microsoft YaHei" w:hAnsi="Microsoft YaHei" w:eastAsia="Microsoft YaHei"/>
               </w:rPr>
               <w:t>打开图片查看器 → 扫描条码</w:t>
+            </w:r>
+          </w:p>
+        </w:tc>
+      </w:tr>
+      <w:tr>
+        <w:tc>
+          <w:tcPr>
+            <w:tcW w:type="dxa" w:w="3600"/>
+          </w:tcPr>
+          <w:p>
+            <w:r>
+              <w:rPr>
+                <w:rFonts w:ascii="Microsoft YaHei" w:hAnsi="Microsoft YaHei" w:eastAsia="Microsoft YaHei"/>
+              </w:rPr>
+              <w:t>解除 Windows"文件已阻止"提示</w:t>
+            </w:r>
+          </w:p>
+        </w:tc>
+        <w:tc>
+          <w:tcPr>
+            <w:tcW w:type="dxa" w:w="6480"/>
+          </w:tcPr>
+          <w:p>
+            <w:r>
+              <w:rPr>
+                <w:rFonts w:ascii="Microsoft YaHei" w:hAnsi="Microsoft YaHei" w:eastAsia="Microsoft YaHei"/>
+              </w:rPr>
+              <w:t>右键 DMS.exe → 属性 → 勾选"解除锁定" → 应用 → 确定</w:t>
+            </w:r>
+          </w:p>
+        </w:tc>
+      </w:tr>
+      <w:tr>
+        <w:tc>
+          <w:tcPr>
+            <w:tcW w:type="dxa" w:w="3600"/>
+          </w:tcPr>
+          <w:p>
+            <w:r>
+              <w:rPr>
+                <w:rFonts w:ascii="Microsoft YaHei" w:hAnsi="Microsoft YaHei" w:eastAsia="Microsoft YaHei"/>
+              </w:rPr>
+              <w:t>继续上次的项目 / 新建空白项目</w:t>
+            </w:r>
+          </w:p>
+        </w:tc>
+        <w:tc>
+          <w:tcPr>
+            <w:tcW w:type="dxa" w:w="6480"/>
+          </w:tcPr>
+          <w:p>
+            <w:r>
+              <w:rPr>
+                <w:rFonts w:ascii="Microsoft YaHei" w:hAnsi="Microsoft YaHei" w:eastAsia="Microsoft YaHei"/>
+              </w:rPr>
+              <w:t>双击 DMS.app / DMS.exe → 启动窗口选择对应按钮</w:t>
+            </w:r>
+          </w:p>
+        </w:tc>
+      </w:tr>
+      <w:tr>
+        <w:tc>
+          <w:tcPr>
+            <w:tcW w:type="dxa" w:w="3600"/>
+          </w:tcPr>
+          <w:p>
+            <w:r>
+              <w:rPr>
+                <w:rFonts w:ascii="Microsoft YaHei" w:hAnsi="Microsoft YaHei" w:eastAsia="Microsoft YaHei"/>
+              </w:rPr>
+              <w:t>合并另一个项目进来</w:t>
+            </w:r>
+          </w:p>
+        </w:tc>
+        <w:tc>
+          <w:tcPr>
+            <w:tcW w:type="dxa" w:w="6480"/>
+          </w:tcPr>
+          <w:p>
+            <w:r>
+              <w:rPr>
+                <w:rFonts w:ascii="Microsoft YaHei" w:hAnsi="Microsoft YaHei" w:eastAsia="Microsoft YaHei"/>
+              </w:rPr>
+              <w:t>项目菜单 → 合并其他子项目… → 添加子项目文件夹 → 合并</w:t>
+            </w:r>
+          </w:p>
+        </w:tc>
+      </w:tr>
+      <w:tr>
+        <w:tc>
+          <w:tcPr>
+            <w:tcW w:type="dxa" w:w="3600"/>
+          </w:tcPr>
+          <w:p>
+            <w:r>
+              <w:rPr>
+                <w:rFonts w:ascii="Microsoft YaHei" w:hAnsi="Microsoft YaHei" w:eastAsia="Microsoft YaHei"/>
+              </w:rPr>
+              <w:t>对文件夹里多份文档一起提问 AI</w:t>
+            </w:r>
+          </w:p>
+        </w:tc>
+        <w:tc>
+          <w:tcPr>
+            <w:tcW w:type="dxa" w:w="6480"/>
+          </w:tcPr>
+          <w:p>
+            <w:r>
+              <w:rPr>
+                <w:rFonts w:ascii="Microsoft YaHei" w:hAnsi="Microsoft YaHei" w:eastAsia="Microsoft YaHei"/>
+              </w:rPr>
+              <w:t>文件夹工具栏 → 问 AI → 勾选文档 → 直接问 AI</w:t>
+            </w:r>
+          </w:p>
+        </w:tc>
+      </w:tr>
+      <w:tr>
+        <w:tc>
+          <w:tcPr>
+            <w:tcW w:type="dxa" w:w="3600"/>
+          </w:tcPr>
+          <w:p>
+            <w:r>
+              <w:rPr>
+                <w:rFonts w:ascii="Microsoft YaHei" w:hAnsi="Microsoft YaHei" w:eastAsia="Microsoft YaHei"/>
+              </w:rPr>
+              <w:t>批量转换图片/PDF为独立 PDF</w:t>
+            </w:r>
+          </w:p>
+        </w:tc>
+        <w:tc>
+          <w:tcPr>
+            <w:tcW w:type="dxa" w:w="6480"/>
+          </w:tcPr>
+          <w:p>
+            <w:r>
+              <w:rPr>
+                <w:rFonts w:ascii="Microsoft YaHei" w:hAnsi="Microsoft YaHei" w:eastAsia="Microsoft YaHei"/>
+              </w:rPr>
+              <w:t>选择文档 → 转换为 PDF → 确认转换</w:t>
+            </w:r>
+          </w:p>
+        </w:tc>
+      </w:tr>
+      <w:tr>
+        <w:tc>
+          <w:tcPr>
+            <w:tcW w:type="dxa" w:w="3600"/>
+          </w:tcPr>
+          <w:p>
+            <w:r>
+              <w:rPr>
+                <w:rFonts w:ascii="Microsoft YaHei" w:hAnsi="Microsoft YaHei" w:eastAsia="Microsoft YaHei"/>
+              </w:rPr>
+              <w:t>把图标视图弹出成独立窗口</w:t>
+            </w:r>
+          </w:p>
+        </w:tc>
+        <w:tc>
+          <w:tcPr>
+            <w:tcW w:type="dxa" w:w="6480"/>
+          </w:tcPr>
+          <w:p>
+            <w:r>
+              <w:rPr>
+                <w:rFonts w:ascii="Microsoft YaHei" w:hAnsi="Microsoft YaHei" w:eastAsia="Microsoft YaHei"/>
+              </w:rPr>
+              <w:t>切换到图标视图 → 弹出</w:t>
+            </w:r>
+          </w:p>
+        </w:tc>
+      </w:tr>
+      <w:tr>
+        <w:tc>
+          <w:tcPr>
+            <w:tcW w:type="dxa" w:w="3600"/>
+          </w:tcPr>
+          <w:p>
+            <w:r>
+              <w:rPr>
+                <w:rFonts w:ascii="Microsoft YaHei" w:hAnsi="Microsoft YaHei" w:eastAsia="Microsoft YaHei"/>
+              </w:rPr>
+              <w:t>批量勾选文件夹并删除/下载</w:t>
+            </w:r>
+          </w:p>
+        </w:tc>
+        <w:tc>
+          <w:tcPr>
+            <w:tcW w:type="dxa" w:w="6480"/>
+          </w:tcPr>
+          <w:p>
+            <w:r>
+              <w:rPr>
+                <w:rFonts w:ascii="Microsoft YaHei" w:hAnsi="Microsoft YaHei" w:eastAsia="Microsoft YaHei"/>
+              </w:rPr>
+              <w:t>树形工具栏 → 多选文件夹 → 勾选 → 下载/删除</w:t>
+            </w:r>
+          </w:p>
+        </w:tc>
+      </w:tr>
+      <w:tr>
+        <w:tc>
+          <w:tcPr>
+            <w:tcW w:type="dxa" w:w="3600"/>
+          </w:tcPr>
+          <w:p>
+            <w:r>
+              <w:rPr>
+                <w:rFonts w:ascii="Microsoft YaHei" w:hAnsi="Microsoft YaHei" w:eastAsia="Microsoft YaHei"/>
+              </w:rPr>
+              <w:t>画参数随时间变化的趋势图</w:t>
+            </w:r>
+          </w:p>
+        </w:tc>
+        <w:tc>
+          <w:tcPr>
+            <w:tcW w:type="dxa" w:w="6480"/>
+          </w:tcPr>
+          <w:p>
+            <w:r>
+              <w:rPr>
+                <w:rFonts w:ascii="Microsoft YaHei" w:hAnsi="Microsoft YaHei" w:eastAsia="Microsoft YaHei"/>
+              </w:rPr>
+              <w:t>选择文件夹 → 趋势图 → 选择参数 → 保存快照</w:t>
+            </w:r>
+          </w:p>
+        </w:tc>
+      </w:tr>
+      <w:tr>
+        <w:tc>
+          <w:tcPr>
+            <w:tcW w:type="dxa" w:w="3600"/>
+          </w:tcPr>
+          <w:p>
+            <w:r>
+              <w:rPr>
+                <w:rFonts w:ascii="Microsoft YaHei" w:hAnsi="Microsoft YaHei" w:eastAsia="Microsoft YaHei"/>
+              </w:rPr>
+              <w:t>按文件夹结构自动生成 Word 数据手册</w:t>
+            </w:r>
+          </w:p>
+        </w:tc>
+        <w:tc>
+          <w:tcPr>
+            <w:tcW w:type="dxa" w:w="6480"/>
+          </w:tcPr>
+          <w:p>
+            <w:r>
+              <w:rPr>
+                <w:rFonts w:ascii="Microsoft YaHei" w:hAnsi="Microsoft YaHei" w:eastAsia="Microsoft YaHei"/>
+              </w:rPr>
+              <w:t>【数据手册】标签 → 按文件夹自动生成（Word）→ 勾选文件夹</w:t>
+            </w:r>
+          </w:p>
+        </w:tc>
+      </w:tr>
+      <w:tr>
+        <w:tc>
+          <w:tcPr>
+            <w:tcW w:type="dxa" w:w="3600"/>
+          </w:tcPr>
+          <w:p>
+            <w:r>
+              <w:rPr>
+                <w:rFonts w:ascii="Microsoft YaHei" w:hAnsi="Microsoft YaHei" w:eastAsia="Microsoft YaHei"/>
+              </w:rPr>
+              <w:t>配置 Gemini / DeepSeek API Key</w:t>
+            </w:r>
+          </w:p>
+        </w:tc>
+        <w:tc>
+          <w:tcPr>
+            <w:tcW w:type="dxa" w:w="6480"/>
+          </w:tcPr>
+          <w:p>
+            <w:r>
+              <w:rPr>
+                <w:rFonts w:ascii="Microsoft YaHei" w:hAnsi="Microsoft YaHei" w:eastAsia="Microsoft YaHei"/>
+              </w:rPr>
+              <w:t>任意"配置 AI"链接 → 粘贴 Key → 保存</w:t>
             </w:r>
           </w:p>
         </w:tc>

</xml_diff>